<commit_message>
docs(lab6): embed dedicated screenshots for every single step from 1 to 14 in DOCX and PDF report
</commit_message>
<xml_diff>
--- a/FirstSemester/web/lab6/07_report/Лемішка_ПП-24_Л6_ChargeUA.docx
+++ b/FirstSemester/web/lab6/07_report/Лемішка_ПП-24_Л6_ChargeUA.docx
@@ -189,7 +189,7 @@
           <w:i/>
           <w:sz w:val="22"/>
         </w:rPr>
-        <w:t>Специфікація проєкту: вебагрегатор та інформаційний пошуковик зарядних станцій в Україні (каталог станцій з живими статусами у містах Київ, Львів, Одеса, Дніпро, Харків, Вінниця та пошукові переваги сервісу без транзакцій і бронювань)</w:t>
+        <w:t>Специфікація проєкту: вебагрегатор та інформаційний пошуковик швидкісних зарядних станцій в Україні (каталог станцій з живими статусами у містах Київ, Львів, Одеса, Дніпро, Харків, Вінниця та пошукові переваги сервісу без транзакцій і бронювань)</w:t>
       </w:r>
     </w:p>
     <w:p>
@@ -325,11 +325,27 @@
     </w:p>
     <w:p>
       <w:pPr>
+        <w:keepNext/>
+        <w:spacing w:before="200" w:after="80"/>
+        <w:jc w:val="left"/>
+      </w:pPr>
+      <w:r>
+        <w:rPr>
+          <w:rFonts w:ascii="Times New Roman" w:hAnsi="Times New Roman" w:cs="Times New Roman"/>
+          <w:b/>
+          <w:i w:val="0"/>
+          <w:sz w:val="26"/>
+        </w:rPr>
+        <w:t>Етап 1. Підготовка проєкту та робочого середовища</w:t>
+      </w:r>
+    </w:p>
+    <w:p>
+      <w:pPr>
         <w:spacing w:before="40" w:after="60" w:line="276" w:lineRule="auto"/>
         <w:jc w:val="both"/>
       </w:pPr>
       <w:r>
-        <w:t>Лабораторна робота №6 є логічним продовженням розробки вебінтерфейсу ChargeUA, розпочатого в ЛР №5. На початковому етапі було створено резервну копію кодової бази ЛР №5 та налаштовано робоче середовище редактора VS Code. Для ефективної роботи з утилітарними класами Tailwind CSS було встановлено та активовано ключові розширення:</w:t>
+        <w:t>Лабораторна робота №6 є прямим продовженням розробки вебінтерфейсу ChargeUA, спроєктованого у Figma (ЛР №4) та зверстаного на рівні семантичного скелета у ЛР №5. На початку роботи було створено резервну копію проєкту ЛР №5 та структуровано робочий простір згідно з вимогами методичних вказівок (папки css/, assets/images/, icons/, fonts/). У редакторі коду Visual Studio Code було встановлено та активовано спеціалізовані розширення для роботи з утилітарним CSS:</w:t>
       </w:r>
     </w:p>
     <w:p>
@@ -407,6 +423,62 @@
     <w:p>
       <w:pPr>
         <w:keepNext/>
+        <w:spacing w:before="120" w:after="40"/>
+        <w:jc w:val="center"/>
+      </w:pPr>
+      <w:r>
+        <w:drawing>
+          <wp:inline xmlns:a="http://schemas.openxmlformats.org/drawingml/2006/main" xmlns:pic="http://schemas.openxmlformats.org/drawingml/2006/picture">
+            <wp:extent cx="5669280" cy="3188970"/>
+            <wp:docPr id="2" name="Picture 2"/>
+            <wp:cNvGraphicFramePr>
+              <a:graphicFrameLocks noChangeAspect="1"/>
+            </wp:cNvGraphicFramePr>
+            <a:graphic>
+              <a:graphicData uri="http://schemas.openxmlformats.org/drawingml/2006/picture">
+                <pic:pic>
+                  <pic:nvPicPr>
+                    <pic:cNvPr id="0" name="00_vscode_environment.png"/>
+                    <pic:cNvPicPr/>
+                  </pic:nvPicPr>
+                  <pic:blipFill>
+                    <a:blip r:embed="rId10"/>
+                    <a:stretch>
+                      <a:fillRect/>
+                    </a:stretch>
+                  </pic:blipFill>
+                  <pic:spPr>
+                    <a:xfrm>
+                      <a:off x="0" y="0"/>
+                      <a:ext cx="5669280" cy="3188970"/>
+                    </a:xfrm>
+                    <a:prstGeom prst="rect"/>
+                  </pic:spPr>
+                </pic:pic>
+              </a:graphicData>
+            </a:graphic>
+          </wp:inline>
+        </w:drawing>
+      </w:r>
+    </w:p>
+    <w:p>
+      <w:pPr>
+        <w:spacing w:before="40" w:after="160"/>
+        <w:jc w:val="center"/>
+      </w:pPr>
+      <w:r>
+        <w:rPr>
+          <w:rFonts w:ascii="Times New Roman" w:hAnsi="Times New Roman" w:cs="Times New Roman"/>
+          <w:b/>
+          <w:i w:val="0"/>
+          <w:sz w:val="22"/>
+        </w:rPr>
+        <w:t>Рис. 1. Етап 1: Робоче середовище VS Code, структура файлів проєкту ChargeUA та налаштовані розширення Tailwind IntelliSense</w:t>
+      </w:r>
+    </w:p>
+    <w:p>
+      <w:pPr>
+        <w:keepNext/>
         <w:spacing w:before="200" w:after="80"/>
         <w:jc w:val="left"/>
       </w:pPr>
@@ -417,7 +489,7 @@
           <w:i w:val="0"/>
           <w:sz w:val="26"/>
         </w:rPr>
-        <w:t>Порівняння традиційного CSS та Utility-First підходу</w:t>
+        <w:t>Етап 2. Знайомство з Tailwind CSS та розбір утилітарних класів</w:t>
       </w:r>
     </w:p>
     <w:p>
@@ -426,7 +498,7 @@
         <w:jc w:val="both"/>
       </w:pPr>
       <w:r>
-        <w:t>Традиційний підхід вимагає вигадування семантичних назв класів (наприклад, .primary-button) та написання відповідних стилів в окремому файлі. Підхід Tailwind CSS (Utility-First) полягає у застосуванні низькорівневих утилітарних класів прямо в розмітці HTML. Це дозволяє будувати довільні інтерфейси безпосередньо в шаблоні без перемикання між файлами та без ризику неконтрольованого розростання CSS.</w:t>
+        <w:t>Традиційний підхід вимагає створення семантичних класів (.primary-button) та написання правил в окремому CSS-файлі. Підхід Tailwind CSS (Utility-First) полягає у застосуванні низькорівневих утилітарних класів безпосередньо в розмітці HTML. Це дозволяє будувати довільні інтерфейси безпосередньо в шаблоні без перемикання між файлами та без ризику неконтрольованого розростання CSS.</w:t>
       </w:r>
     </w:p>
     <w:tbl>
@@ -468,7 +540,7 @@
                 <w:i w:val="0"/>
                 <w:sz w:val="22"/>
               </w:rPr>
-              <w:t xml:space="preserve">Порівняння коду кнопки: </w:t>
+              <w:t xml:space="preserve">Порівняння коду кнопки (Класичний CSS vs Tailwind): </w:t>
             </w:r>
             <w:r>
               <w:rPr>
@@ -507,7 +579,7 @@
         <w:jc w:val="both"/>
       </w:pPr>
       <w:r>
-        <w:t>Анатомія утилітарних класів кнопки ChargeUA:</w:t>
+        <w:t>Анатомія утилітарних класів кнопки ChargeUA (за результатами обговорення з ШІ-чатом):</w:t>
       </w:r>
     </w:p>
     <w:p>
@@ -633,6 +705,62 @@
     <w:p>
       <w:pPr>
         <w:keepNext/>
+        <w:spacing w:before="120" w:after="40"/>
+        <w:jc w:val="center"/>
+      </w:pPr>
+      <w:r>
+        <w:drawing>
+          <wp:inline xmlns:a="http://schemas.openxmlformats.org/drawingml/2006/main" xmlns:pic="http://schemas.openxmlformats.org/drawingml/2006/picture">
+            <wp:extent cx="5669280" cy="3485793"/>
+            <wp:docPr id="3" name="Picture 3"/>
+            <wp:cNvGraphicFramePr>
+              <a:graphicFrameLocks noChangeAspect="1"/>
+            </wp:cNvGraphicFramePr>
+            <a:graphic>
+              <a:graphicData uri="http://schemas.openxmlformats.org/drawingml/2006/picture">
+                <pic:pic>
+                  <pic:nvPicPr>
+                    <pic:cNvPr id="0" name="02_step2_chat_tailwind_comparison.png"/>
+                    <pic:cNvPicPr/>
+                  </pic:nvPicPr>
+                  <pic:blipFill>
+                    <a:blip r:embed="rId11"/>
+                    <a:stretch>
+                      <a:fillRect/>
+                    </a:stretch>
+                  </pic:blipFill>
+                  <pic:spPr>
+                    <a:xfrm>
+                      <a:off x="0" y="0"/>
+                      <a:ext cx="5669280" cy="3485793"/>
+                    </a:xfrm>
+                    <a:prstGeom prst="rect"/>
+                  </pic:spPr>
+                </pic:pic>
+              </a:graphicData>
+            </a:graphic>
+          </wp:inline>
+        </w:drawing>
+      </w:r>
+    </w:p>
+    <w:p>
+      <w:pPr>
+        <w:spacing w:before="40" w:after="160"/>
+        <w:jc w:val="center"/>
+      </w:pPr>
+      <w:r>
+        <w:rPr>
+          <w:rFonts w:ascii="Times New Roman" w:hAnsi="Times New Roman" w:cs="Times New Roman"/>
+          <w:b/>
+          <w:i w:val="0"/>
+          <w:sz w:val="22"/>
+        </w:rPr>
+        <w:t>Рис. 2. Етап 2: Зіставлення семантичного CSS та utility-first підходу Tailwind CSS з детальним розбором утиліт</w:t>
+      </w:r>
+    </w:p>
+    <w:p>
+      <w:pPr>
+        <w:keepNext/>
         <w:spacing w:before="200" w:after="80"/>
         <w:jc w:val="left"/>
       </w:pPr>
@@ -643,7 +771,7 @@
           <w:i w:val="0"/>
           <w:sz w:val="26"/>
         </w:rPr>
-        <w:t>Підключення Tailwind CSS через CDN</w:t>
+        <w:t>Етап 3. Підключення Tailwind CSS через CDN</w:t>
       </w:r>
     </w:p>
     <w:p>
@@ -743,8 +871,8 @@
       <w:r>
         <w:drawing>
           <wp:inline xmlns:a="http://schemas.openxmlformats.org/drawingml/2006/main" xmlns:pic="http://schemas.openxmlformats.org/drawingml/2006/picture">
-            <wp:extent cx="5669280" cy="3188970"/>
-            <wp:docPr id="2" name="Picture 2"/>
+            <wp:extent cx="5669280" cy="3485793"/>
+            <wp:docPr id="4" name="Picture 4"/>
             <wp:cNvGraphicFramePr>
               <a:graphicFrameLocks noChangeAspect="1"/>
             </wp:cNvGraphicFramePr>
@@ -752,11 +880,11 @@
               <a:graphicData uri="http://schemas.openxmlformats.org/drawingml/2006/picture">
                 <pic:pic>
                   <pic:nvPicPr>
-                    <pic:cNvPr id="0" name="00_vscode_environment.png"/>
+                    <pic:cNvPr id="0" name="03_step3_head_cdn_connection.png"/>
                     <pic:cNvPicPr/>
                   </pic:nvPicPr>
                   <pic:blipFill>
-                    <a:blip r:embed="rId10"/>
+                    <a:blip r:embed="rId12"/>
                     <a:stretch>
                       <a:fillRect/>
                     </a:stretch>
@@ -764,7 +892,7 @@
                   <pic:spPr>
                     <a:xfrm>
                       <a:off x="0" y="0"/>
-                      <a:ext cx="5669280" cy="3188970"/>
+                      <a:ext cx="5669280" cy="3485793"/>
                     </a:xfrm>
                     <a:prstGeom prst="rect"/>
                   </pic:spPr>
@@ -787,7 +915,7 @@
           <w:i w:val="0"/>
           <w:sz w:val="22"/>
         </w:rPr>
-        <w:t>Рис. 1.1. Робоче середовище VS Code: структура файлів проєкту ChargeUA та налаштування розширень</w:t>
+        <w:t>Рис. 3. Етап 3: Підключення Tailwind CSS через офіційний CDN скрипт та стилів styles.css у секції &lt;head&gt; index.html</w:t>
       </w:r>
     </w:p>
     <w:p>
@@ -808,15 +936,6 @@
     </w:p>
     <w:p>
       <w:pPr>
-        <w:spacing w:before="40" w:after="60" w:line="276" w:lineRule="auto"/>
-        <w:jc w:val="both"/>
-      </w:pPr>
-      <w:r>
-        <w:t>Відповідно до Етапу 4 методичних вказівок, дослідження можливостей фреймворку було проведено в офіційній інтерактивній пісочниці Tailwind Play (https://play.tailwindcss.com/). Цей сервіс дозволяє тестувати роботу JIT-компілятора Tailwind у браузері в реальному часі без локального складання проєкту.</w:t>
-      </w:r>
-    </w:p>
-    <w:p>
-      <w:pPr>
         <w:keepNext/>
         <w:spacing w:before="200" w:after="80"/>
         <w:jc w:val="left"/>
@@ -828,12 +947,118 @@
           <w:i w:val="0"/>
           <w:sz w:val="26"/>
         </w:rPr>
-        <w:t>Промпт-лог створення інтерактивної кнопки (Button)</w:t>
+        <w:t>Етап 4. Знайомство з пісочницею Tailwind Play</w:t>
       </w:r>
     </w:p>
     <w:p>
       <w:pPr>
-        <w:spacing w:before="60" w:after="40" w:line="276" w:lineRule="auto"/>
+        <w:spacing w:before="40" w:after="60" w:line="276" w:lineRule="auto"/>
+        <w:jc w:val="both"/>
+      </w:pPr>
+      <w:r>
+        <w:t>Відповідно до Етапу 4 методичних вказівок, дослідження можливостей фреймворку було проведено в офіційній інтерактивній пісочниці Tailwind Play (https://play.tailwindcss.com/). Було досліджено структуру середовища: зони розмітки HTML, вставки кастомного CSS, конфігурації, панель живого попереднього перегляду (Live Preview), інструменти перевірки адаптивності та розмір автоматично згенерованого CSS (2.42 kB). Проведено експерименти зі зміною кольорів, розмірів та радіусів для різних HTML-елементів (&lt;p&gt;, &lt;h1&gt;, &lt;div&gt;).</w:t>
+      </w:r>
+    </w:p>
+    <w:p>
+      <w:pPr>
+        <w:keepNext/>
+        <w:spacing w:before="120" w:after="40"/>
+        <w:jc w:val="center"/>
+      </w:pPr>
+      <w:r>
+        <w:drawing>
+          <wp:inline xmlns:a="http://schemas.openxmlformats.org/drawingml/2006/main" xmlns:pic="http://schemas.openxmlformats.org/drawingml/2006/picture">
+            <wp:extent cx="5669280" cy="2551176"/>
+            <wp:docPr id="5" name="Picture 5"/>
+            <wp:cNvGraphicFramePr>
+              <a:graphicFrameLocks noChangeAspect="1"/>
+            </wp:cNvGraphicFramePr>
+            <a:graphic>
+              <a:graphicData uri="http://schemas.openxmlformats.org/drawingml/2006/picture">
+                <pic:pic>
+                  <pic:nvPicPr>
+                    <pic:cNvPr id="0" name="04_tailwind_play_environment.png"/>
+                    <pic:cNvPicPr/>
+                  </pic:nvPicPr>
+                  <pic:blipFill>
+                    <a:blip r:embed="rId13"/>
+                    <a:stretch>
+                      <a:fillRect/>
+                    </a:stretch>
+                  </pic:blipFill>
+                  <pic:spPr>
+                    <a:xfrm>
+                      <a:off x="0" y="0"/>
+                      <a:ext cx="5669280" cy="2551176"/>
+                    </a:xfrm>
+                    <a:prstGeom prst="rect"/>
+                  </pic:spPr>
+                </pic:pic>
+              </a:graphicData>
+            </a:graphic>
+          </wp:inline>
+        </w:drawing>
+      </w:r>
+    </w:p>
+    <w:p>
+      <w:pPr>
+        <w:spacing w:before="40" w:after="160"/>
+        <w:jc w:val="center"/>
+      </w:pPr>
+      <w:r>
+        <w:rPr>
+          <w:rFonts w:ascii="Times New Roman" w:hAnsi="Times New Roman" w:cs="Times New Roman"/>
+          <w:b/>
+          <w:i w:val="0"/>
+          <w:sz w:val="22"/>
+        </w:rPr>
+        <w:t>Рис. 4. Етап 4: Інтерфейс онлайн-пісочниці Tailwind Play (v4.3, зони редактора HTML/CSS, прев'ю та згенерований бандл)</w:t>
+      </w:r>
+    </w:p>
+    <w:p>
+      <w:pPr>
+        <w:keepNext/>
+        <w:spacing w:before="200" w:after="80"/>
+        <w:jc w:val="left"/>
+      </w:pPr>
+      <w:r>
+        <w:rPr>
+          <w:rFonts w:ascii="Times New Roman" w:hAnsi="Times New Roman" w:cs="Times New Roman"/>
+          <w:b/>
+          <w:i w:val="0"/>
+          <w:sz w:val="26"/>
+        </w:rPr>
+        <w:t>Етап 5. Створення першого UI-компонента (Button)</w:t>
+      </w:r>
+    </w:p>
+    <w:p>
+      <w:pPr>
+        <w:spacing w:before="40" w:after="60" w:line="276" w:lineRule="auto"/>
+        <w:jc w:val="both"/>
+      </w:pPr>
+      <w:r>
+        <w:t>За допомогою ШІ-чату було сформульовано системний промпт для створення кнопки Primary CTA Button «Знайти станцію» із дотриманням суворих вимог доступності (WCAG) та ергономіки тач-пристроїв.</w:t>
+      </w:r>
+    </w:p>
+    <w:p>
+      <w:pPr>
+        <w:keepNext/>
+        <w:spacing w:before="160" w:after="40"/>
+        <w:jc w:val="left"/>
+      </w:pPr>
+      <w:r>
+        <w:rPr>
+          <w:rFonts w:ascii="Times New Roman" w:hAnsi="Times New Roman" w:cs="Times New Roman"/>
+          <w:b/>
+          <w:i w:val="0"/>
+          <w:sz w:val="24"/>
+        </w:rPr>
+        <w:t>Промпт-лог створення кнопки</w:t>
+      </w:r>
+    </w:p>
+    <w:p>
+      <w:pPr>
+        <w:spacing w:before="40" w:after="40" w:line="276" w:lineRule="auto"/>
         <w:jc w:val="both"/>
       </w:pPr>
       <w:r>
@@ -926,7 +1151,7 @@
           <w:i w:val="0"/>
           <w:sz w:val="24"/>
         </w:rPr>
-        <w:t>ШІ-асистент згенерував чистий ізольований компонент кнопки з іконкою стрілки, повною підтримкою станів фокусу та доступності.</w:t>
+        <w:t>Отримано семантичний код кнопки із вбудованою SVG-іконкою стрілки, ефектами плавної зміни фону та розміром 44px.</w:t>
       </w:r>
     </w:p>
     <w:p>
@@ -941,7 +1166,7 @@
           <w:i w:val="0"/>
           <w:sz w:val="24"/>
         </w:rPr>
-        <w:t xml:space="preserve">Аналіз недоліків та коригування: </w:t>
+        <w:t xml:space="preserve">Аналіз недоліків: </w:t>
       </w:r>
       <w:r>
         <w:rPr>
@@ -950,12 +1175,12 @@
           <w:i w:val="0"/>
           <w:sz w:val="24"/>
         </w:rPr>
-        <w:t>Початкова кнопка не мала неонової тіні, притаманної темній темі ChargeUA, та була протестована ізольовано. Необхідно було додати тінь shadow-lg shadow-blue-600/30 та протестувати її у зв'язці з міні-карткою станції безпосередньо у пісочниці Tailwind Play.</w:t>
+        <w:t>Кнопка потребувала валідації в реальному темному оточенні поруч із карткою зарядної станції у пісочниці Tailwind Play.</w:t>
       </w:r>
     </w:p>
     <w:p>
       <w:pPr>
-        <w:spacing w:before="60" w:after="40" w:line="276" w:lineRule="auto"/>
+        <w:spacing w:before="40" w:after="40" w:line="276" w:lineRule="auto"/>
         <w:jc w:val="both"/>
       </w:pPr>
       <w:r>
@@ -1048,7 +1273,7 @@
           <w:i w:val="0"/>
           <w:sz w:val="24"/>
         </w:rPr>
-        <w:t>Код було вставлено у Tailwind Play. Згенеровано візуальний попередній перегляд, перевірено автоматичне оновлення розмірів та згенерованого CSS (розмір всього 2.42 kB).</w:t>
+        <w:t>Код було протестовано у Tailwind Play. Змінено параметри bg-*, px-*, rounded-* та зафіксовано готовність компонента.</w:t>
       </w:r>
     </w:p>
     <w:p>
@@ -1061,7 +1286,7 @@
         <w:drawing>
           <wp:inline xmlns:a="http://schemas.openxmlformats.org/drawingml/2006/main" xmlns:pic="http://schemas.openxmlformats.org/drawingml/2006/picture">
             <wp:extent cx="5669280" cy="2551176"/>
-            <wp:docPr id="3" name="Picture 3"/>
+            <wp:docPr id="6" name="Picture 6"/>
             <wp:cNvGraphicFramePr>
               <a:graphicFrameLocks noChangeAspect="1"/>
             </wp:cNvGraphicFramePr>
@@ -1069,11 +1294,11 @@
               <a:graphicData uri="http://schemas.openxmlformats.org/drawingml/2006/picture">
                 <pic:pic>
                   <pic:nvPicPr>
-                    <pic:cNvPr id="0" name="04_tailwind_play_environment.png"/>
+                    <pic:cNvPr id="0" name="04_tailwind_play_button_experiment.png"/>
                     <pic:cNvPicPr/>
                   </pic:nvPicPr>
                   <pic:blipFill>
-                    <a:blip r:embed="rId11"/>
+                    <a:blip r:embed="rId14"/>
                     <a:stretch>
                       <a:fillRect/>
                     </a:stretch>
@@ -1104,63 +1329,7 @@
           <w:i w:val="0"/>
           <w:sz w:val="22"/>
         </w:rPr>
-        <w:t>Рис. 2.1. Дослідження робочої зони онлайн-пісочниці Tailwind Play (v4.3, розмітка HTML, вивід CSS та панель прев'ю)</w:t>
-      </w:r>
-    </w:p>
-    <w:p>
-      <w:pPr>
-        <w:keepNext/>
-        <w:spacing w:before="120" w:after="40"/>
-        <w:jc w:val="center"/>
-      </w:pPr>
-      <w:r>
-        <w:drawing>
-          <wp:inline xmlns:a="http://schemas.openxmlformats.org/drawingml/2006/main" xmlns:pic="http://schemas.openxmlformats.org/drawingml/2006/picture">
-            <wp:extent cx="5669280" cy="2551176"/>
-            <wp:docPr id="4" name="Picture 4"/>
-            <wp:cNvGraphicFramePr>
-              <a:graphicFrameLocks noChangeAspect="1"/>
-            </wp:cNvGraphicFramePr>
-            <a:graphic>
-              <a:graphicData uri="http://schemas.openxmlformats.org/drawingml/2006/picture">
-                <pic:pic>
-                  <pic:nvPicPr>
-                    <pic:cNvPr id="0" name="04_tailwind_play_button_experiment.png"/>
-                    <pic:cNvPicPr/>
-                  </pic:nvPicPr>
-                  <pic:blipFill>
-                    <a:blip r:embed="rId12"/>
-                    <a:stretch>
-                      <a:fillRect/>
-                    </a:stretch>
-                  </pic:blipFill>
-                  <pic:spPr>
-                    <a:xfrm>
-                      <a:off x="0" y="0"/>
-                      <a:ext cx="5669280" cy="2551176"/>
-                    </a:xfrm>
-                    <a:prstGeom prst="rect"/>
-                  </pic:spPr>
-                </pic:pic>
-              </a:graphicData>
-            </a:graphic>
-          </wp:inline>
-        </w:drawing>
-      </w:r>
-    </w:p>
-    <w:p>
-      <w:pPr>
-        <w:spacing w:before="40" w:after="160"/>
-        <w:jc w:val="center"/>
-      </w:pPr>
-      <w:r>
-        <w:rPr>
-          <w:rFonts w:ascii="Times New Roman" w:hAnsi="Times New Roman" w:cs="Times New Roman"/>
-          <w:b/>
-          <w:i w:val="0"/>
-          <w:sz w:val="22"/>
-        </w:rPr>
-        <w:t>Рис. 2.2. Тестування згенерованої кнопки та картки станції ChargeUA в Tailwind Play</w:t>
+        <w:t>Рис. 5. Етап 5: Створення та інтерактивне тестування Primary Button та картки станції у Tailwind Play</w:t>
       </w:r>
     </w:p>
     <w:p>
@@ -1181,15 +1350,6 @@
     </w:p>
     <w:p>
       <w:pPr>
-        <w:spacing w:before="40" w:after="60" w:line="276" w:lineRule="auto"/>
-        <w:jc w:val="both"/>
-      </w:pPr>
-      <w:r>
-        <w:t>Відповідно до Етапів 6-11 методичних вказівок, на основі дизайну, спроєктованого у Figma (ЛР №4), було створено повний набір модульних семантичних компонентів лендингу ChargeUA. Особливу увагу приділено дотриманню бізнес-логіки проєкту: ChargeUA виступає суто пошуковим помічником та агрегатором, який не проводить фінансових транзакцій і не виконує бронювання станцій.</w:t>
-      </w:r>
-    </w:p>
-    <w:p>
-      <w:pPr>
         <w:keepNext/>
         <w:spacing w:before="200" w:after="80"/>
         <w:jc w:val="left"/>
@@ -1201,220 +1361,16 @@
           <w:i w:val="0"/>
           <w:sz w:val="26"/>
         </w:rPr>
-        <w:t>Створення семантичного Header з адаптивною навігацією</w:t>
+        <w:t>Етап 6. Створення семантичного Header з адаптивною навігацією</w:t>
       </w:r>
     </w:p>
     <w:p>
       <w:pPr>
-        <w:spacing w:before="40" w:after="40" w:line="276" w:lineRule="auto"/>
-        <w:jc w:val="both"/>
-      </w:pPr>
-      <w:r>
-        <w:t>Компонент Header реалізовано з плаваючим закріпленням у верхній частині вікна (sticky top-0 z-50), напівпрозорим розмиттям (backdrop-blur-md) та розмежуванням на мобільний і десктопний режим за принципом Mobile-First:</w:t>
-      </w:r>
-    </w:p>
-    <w:p>
-      <w:pPr>
-        <w:spacing w:before="20" w:after="40" w:line="276" w:lineRule="auto"/>
-        <w:jc w:val="both"/>
-      </w:pPr>
-      <w:r>
-        <w:rPr>
-          <w:rFonts w:ascii="Times New Roman" w:hAnsi="Times New Roman" w:cs="Times New Roman"/>
-          <w:b/>
-          <w:i w:val="0"/>
-          <w:sz w:val="24"/>
-        </w:rPr>
-        <w:t xml:space="preserve">• Мобільний стан (&lt; 768px): </w:t>
-      </w:r>
-      <w:r>
-        <w:rPr>
-          <w:rFonts w:ascii="Times New Roman" w:hAnsi="Times New Roman" w:cs="Times New Roman"/>
-          <w:b w:val="0"/>
-          <w:i w:val="0"/>
-          <w:sz w:val="24"/>
-        </w:rPr>
-        <w:t>логотип розташовано ліворуч, десктопне горизонтальне меню приховано за допомогою класу hidden, праворуч виведено кнопку гамбургер-меню (блок md:hidden).</w:t>
-      </w:r>
-    </w:p>
-    <w:p>
-      <w:pPr>
-        <w:spacing w:before="20" w:after="40" w:line="276" w:lineRule="auto"/>
-        <w:jc w:val="both"/>
-      </w:pPr>
-      <w:r>
-        <w:rPr>
-          <w:rFonts w:ascii="Times New Roman" w:hAnsi="Times New Roman" w:cs="Times New Roman"/>
-          <w:b/>
-          <w:i w:val="0"/>
-          <w:sz w:val="24"/>
-        </w:rPr>
-        <w:t xml:space="preserve">• Десктопний стан (&gt;= 768px, префікс md:): </w:t>
-      </w:r>
-      <w:r>
-        <w:rPr>
-          <w:rFonts w:ascii="Times New Roman" w:hAnsi="Times New Roman" w:cs="Times New Roman"/>
-          <w:b w:val="0"/>
-          <w:i w:val="0"/>
-          <w:sz w:val="24"/>
-        </w:rPr>
-        <w:t>гамбургер-меню автоматично приховується (md:hidden), навігаційні посилання вирівнюються по центру горизонтальним флексом (hidden md:flex items-center gap-8), а праворуч відображається акцентна CTA-кнопка «Знайти станцію».</w:t>
-      </w:r>
-    </w:p>
-    <w:p>
-      <w:pPr>
-        <w:keepNext/>
-        <w:spacing w:before="120" w:after="40"/>
-        <w:jc w:val="center"/>
-      </w:pPr>
-      <w:r>
-        <w:drawing>
-          <wp:inline xmlns:a="http://schemas.openxmlformats.org/drawingml/2006/main" xmlns:pic="http://schemas.openxmlformats.org/drawingml/2006/picture">
-            <wp:extent cx="5669280" cy="2878685"/>
-            <wp:docPr id="5" name="Picture 5"/>
-            <wp:cNvGraphicFramePr>
-              <a:graphicFrameLocks noChangeAspect="1"/>
-            </wp:cNvGraphicFramePr>
-            <a:graphic>
-              <a:graphicData uri="http://schemas.openxmlformats.org/drawingml/2006/picture">
-                <pic:pic>
-                  <pic:nvPicPr>
-                    <pic:cNvPr id="0" name="06_header_desktop_view.png"/>
-                    <pic:cNvPicPr/>
-                  </pic:nvPicPr>
-                  <pic:blipFill>
-                    <a:blip r:embed="rId13"/>
-                    <a:stretch>
-                      <a:fillRect/>
-                    </a:stretch>
-                  </pic:blipFill>
-                  <pic:spPr>
-                    <a:xfrm>
-                      <a:off x="0" y="0"/>
-                      <a:ext cx="5669280" cy="2878685"/>
-                    </a:xfrm>
-                    <a:prstGeom prst="rect"/>
-                  </pic:spPr>
-                </pic:pic>
-              </a:graphicData>
-            </a:graphic>
-          </wp:inline>
-        </w:drawing>
-      </w:r>
-    </w:p>
-    <w:p>
-      <w:pPr>
-        <w:spacing w:before="40" w:after="160"/>
-        <w:jc w:val="center"/>
-      </w:pPr>
-      <w:r>
-        <w:rPr>
-          <w:rFonts w:ascii="Times New Roman" w:hAnsi="Times New Roman" w:cs="Times New Roman"/>
-          <w:b/>
-          <w:i w:val="0"/>
-          <w:sz w:val="22"/>
-        </w:rPr>
-        <w:t>Рис. 3.1. Десктопний вигляд Header та Hero-секції ChargeUA (роздільна здатність 1440px)</w:t>
-      </w:r>
-    </w:p>
-    <w:p>
-      <w:pPr>
-        <w:keepNext/>
-        <w:spacing w:before="120" w:after="40"/>
-        <w:jc w:val="center"/>
-      </w:pPr>
-      <w:r>
-        <w:drawing>
-          <wp:inline xmlns:a="http://schemas.openxmlformats.org/drawingml/2006/main" xmlns:pic="http://schemas.openxmlformats.org/drawingml/2006/picture">
-            <wp:extent cx="5669280" cy="8906285"/>
-            <wp:docPr id="6" name="Picture 6"/>
-            <wp:cNvGraphicFramePr>
-              <a:graphicFrameLocks noChangeAspect="1"/>
-            </wp:cNvGraphicFramePr>
-            <a:graphic>
-              <a:graphicData uri="http://schemas.openxmlformats.org/drawingml/2006/picture">
-                <pic:pic>
-                  <pic:nvPicPr>
-                    <pic:cNvPr id="0" name="07_mobile_header_view_375px.png"/>
-                    <pic:cNvPicPr/>
-                  </pic:nvPicPr>
-                  <pic:blipFill>
-                    <a:blip r:embed="rId14"/>
-                    <a:stretch>
-                      <a:fillRect/>
-                    </a:stretch>
-                  </pic:blipFill>
-                  <pic:spPr>
-                    <a:xfrm>
-                      <a:off x="0" y="0"/>
-                      <a:ext cx="5669280" cy="8906285"/>
-                    </a:xfrm>
-                    <a:prstGeom prst="rect"/>
-                  </pic:spPr>
-                </pic:pic>
-              </a:graphicData>
-            </a:graphic>
-          </wp:inline>
-        </w:drawing>
-      </w:r>
-    </w:p>
-    <w:p>
-      <w:pPr>
-        <w:spacing w:before="40" w:after="160"/>
-        <w:jc w:val="center"/>
-      </w:pPr>
-      <w:r>
-        <w:rPr>
-          <w:rFonts w:ascii="Times New Roman" w:hAnsi="Times New Roman" w:cs="Times New Roman"/>
-          <w:b/>
-          <w:i w:val="0"/>
-          <w:sz w:val="22"/>
-        </w:rPr>
-        <w:t>Рис. 3.2. Мобільний вигляд Header з адаптивною кнопкою виклику меню (роздільна здатність 375px)</w:t>
-      </w:r>
-    </w:p>
-    <w:p>
-      <w:pPr>
-        <w:keepNext/>
-        <w:spacing w:before="200" w:after="80"/>
-        <w:jc w:val="left"/>
-      </w:pPr>
-      <w:r>
-        <w:rPr>
-          <w:rFonts w:ascii="Times New Roman" w:hAnsi="Times New Roman" w:cs="Times New Roman"/>
-          <w:b/>
-          <w:i w:val="0"/>
-          <w:sz w:val="26"/>
-        </w:rPr>
-        <w:t>Дві окремі лінійки платформи ChargeUA</w:t>
-      </w:r>
-    </w:p>
-    <w:p>
-      <w:pPr>
         <w:spacing w:before="40" w:after="60" w:line="276" w:lineRule="auto"/>
         <w:jc w:val="both"/>
       </w:pPr>
       <w:r>
-        <w:t>За вимогами архітектури проєкту ChargeUA на головній сторінці було чітко розмежовано дві окремі функціональні лінійки, що запобігає плутанині між фізичним каталогом локацій та аналітичними можливостями сервісу:</w:t>
-      </w:r>
-    </w:p>
-    <w:p>
-      <w:pPr>
-        <w:spacing w:before="40" w:after="40" w:line="276" w:lineRule="auto"/>
-        <w:jc w:val="both"/>
-      </w:pPr>
-      <w:r>
-        <w:rPr>
-          <w:rFonts w:ascii="Times New Roman" w:hAnsi="Times New Roman" w:cs="Times New Roman"/>
-          <w:b/>
-          <w:i w:val="0"/>
-          <w:sz w:val="24"/>
-        </w:rPr>
-        <w:t>Лінійка 1: Реальний каталог швидкісних зарядних станцій (#stations)</w:t>
-        <w:br/>
-      </w:r>
-      <w:r>
-        <w:t>Представляє адаптивну сітку карток швидкісних зарядних комплексів по реальних містах України (Київ, Львів, Одеса, Дніпро, Харків, Вінниця). Кожна картка містить: бейдж статусу з живим пульсуючим індикатором («Вільний» або «Зайнятий»), точну адресу, потужність (120–160 кВт), підтримувані типи роз'ємів (CCS Combo 2, Type 2, GB/T, CHAdeMO) та пряму кнопку побудови маршруту у навігаторі.</w:t>
+        <w:t>Компонент Header спроєктовано на основі макетів Figma з ЛР №4. Він містить логотип бренду, навігаційні посилання (#stations, #benefits, #calculator, #faq) та акцентну CTA-кнопку «Знайти станцію». У десктопному режимі навігація розміщена по центру, кнопка праворуч, а логотип ліворуч:</w:t>
       </w:r>
     </w:p>
     <w:p>
@@ -1435,7 +1391,7 @@
               <a:graphicData uri="http://schemas.openxmlformats.org/drawingml/2006/picture">
                 <pic:pic>
                   <pic:nvPicPr>
-                    <pic:cNvPr id="0" name="08_stations_catalog_grid_desktop.png"/>
+                    <pic:cNvPr id="0" name="06_header_desktop_view.png"/>
                     <pic:cNvPicPr/>
                   </pic:nvPicPr>
                   <pic:blipFill>
@@ -1470,30 +1426,36 @@
           <w:i w:val="0"/>
           <w:sz w:val="22"/>
         </w:rPr>
-        <w:t>Рис. 3.3. Лінійка 1: Адаптивна 3-колонкова сітка каталогу станцій ChargeUA по містах України</w:t>
+        <w:t>Рис. 6. Етап 6: Десктопний вигляд семантичного Header та Hero-секції ChargeUA (роздільна здатність 1440px)</w:t>
       </w:r>
     </w:p>
     <w:p>
       <w:pPr>
-        <w:spacing w:before="40" w:after="40" w:line="276" w:lineRule="auto"/>
-        <w:jc w:val="both"/>
+        <w:keepNext/>
+        <w:spacing w:before="200" w:after="80"/>
+        <w:jc w:val="left"/>
       </w:pPr>
       <w:r>
         <w:rPr>
           <w:rFonts w:ascii="Times New Roman" w:hAnsi="Times New Roman" w:cs="Times New Roman"/>
           <w:b/>
           <w:i w:val="0"/>
-          <w:sz w:val="24"/>
+          <w:sz w:val="26"/>
         </w:rPr>
-        <w:t>Лінійка 2: Можливості пошуку та переваги агрегатора (#benefits)</w:t>
-        <w:br/>
-      </w:r>
-      <w:r>
-        <w:t>Складається з 6 карток, які пояснюють цінність сервісу-пошуковика для водія електрокара: 1) Моніторинг статусів у реальному часі (оновлення кожні 60 с); 2) Стійкість до блекаутів (позначки станцій з генераторами та промисловими акумуляторами); 3) Розумний фільтр за роз'ємами (відбір портів під європейські, американські та китайські авто); 4) Калькулятор часу та кіловат (попередній прозорий розрахунок без платежів на сайті); 5) Пряма навігація до вільного конектора через Google Maps та Waze; 6) Єдина агрегована база з понад 480 перевірених станцій по всій країні.</w:t>
+        <w:t>Етап 7. Реалізація принципу Mobile First</w:t>
       </w:r>
     </w:p>
     <w:p>
       <w:pPr>
+        <w:spacing w:before="40" w:after="60" w:line="276" w:lineRule="auto"/>
+        <w:jc w:val="both"/>
+      </w:pPr>
+      <w:r>
+        <w:t>Згідно з принципом Mobile First, базові класи Tailwind орієнтовані на найменші екрани (смартфони), а префікси sm:, md:, lg: описують зміни для ширших дисплеїв на основі CSS min-width. У компоненті Header на мобільних пристроях (&lt; 768px) горизонтальне меню приховано за допомогою класу hidden, а замість нього виведено адаптивну кнопку гамбургер-меню (клас md:hidden):</w:t>
+      </w:r>
+    </w:p>
+    <w:p>
+      <w:pPr>
         <w:keepNext/>
         <w:spacing w:before="120" w:after="40"/>
         <w:jc w:val="center"/>
@@ -1501,7 +1463,7 @@
       <w:r>
         <w:drawing>
           <wp:inline xmlns:a="http://schemas.openxmlformats.org/drawingml/2006/main" xmlns:pic="http://schemas.openxmlformats.org/drawingml/2006/picture">
-            <wp:extent cx="5669280" cy="2878685"/>
+            <wp:extent cx="5669280" cy="8906285"/>
             <wp:docPr id="8" name="Picture 8"/>
             <wp:cNvGraphicFramePr>
               <a:graphicFrameLocks noChangeAspect="1"/>
@@ -1510,11 +1472,192 @@
               <a:graphicData uri="http://schemas.openxmlformats.org/drawingml/2006/picture">
                 <pic:pic>
                   <pic:nvPicPr>
-                    <pic:cNvPr id="0" name="09_benefits_search_line_desktop.png"/>
+                    <pic:cNvPr id="0" name="07_mobile_header_view_375px.png"/>
                     <pic:cNvPicPr/>
                   </pic:nvPicPr>
                   <pic:blipFill>
                     <a:blip r:embed="rId16"/>
+                    <a:stretch>
+                      <a:fillRect/>
+                    </a:stretch>
+                  </pic:blipFill>
+                  <pic:spPr>
+                    <a:xfrm>
+                      <a:off x="0" y="0"/>
+                      <a:ext cx="5669280" cy="8906285"/>
+                    </a:xfrm>
+                    <a:prstGeom prst="rect"/>
+                  </pic:spPr>
+                </pic:pic>
+              </a:graphicData>
+            </a:graphic>
+          </wp:inline>
+        </w:drawing>
+      </w:r>
+    </w:p>
+    <w:p>
+      <w:pPr>
+        <w:spacing w:before="40" w:after="160"/>
+        <w:jc w:val="center"/>
+      </w:pPr>
+      <w:r>
+        <w:rPr>
+          <w:rFonts w:ascii="Times New Roman" w:hAnsi="Times New Roman" w:cs="Times New Roman"/>
+          <w:b/>
+          <w:i w:val="0"/>
+          <w:sz w:val="22"/>
+        </w:rPr>
+        <w:t>Рис. 7. Етап 7: Реалізація принципу Mobile First: автоматичне згортання меню в гамбургер на екрані 375px</w:t>
+      </w:r>
+    </w:p>
+    <w:p>
+      <w:pPr>
+        <w:keepNext/>
+        <w:spacing w:before="200" w:after="80"/>
+        <w:jc w:val="left"/>
+      </w:pPr>
+      <w:r>
+        <w:rPr>
+          <w:rFonts w:ascii="Times New Roman" w:hAnsi="Times New Roman" w:cs="Times New Roman"/>
+          <w:b/>
+          <w:i w:val="0"/>
+          <w:sz w:val="26"/>
+        </w:rPr>
+        <w:t>Етап 8. Створення UI-компонента Картки зарядної станції (Card)</w:t>
+      </w:r>
+    </w:p>
+    <w:p>
+      <w:pPr>
+        <w:spacing w:before="40" w:after="60" w:line="276" w:lineRule="auto"/>
+        <w:jc w:val="both"/>
+      </w:pPr>
+      <w:r>
+        <w:t>Створено картку станції ChargeUA, яка містить повний набір технічної інформації для водія електромобіля: статус-бейдж з живим пульсуючим індикатором («Вільний» або «Зайнятий»), точну адресу локації, потужність зарядки (120–160 кВт), перелік підтримуваних конекторів (CCS Combo 2, Type 2, GB/T, CHAdeMO) та кнопку побудови маршруту:</w:t>
+      </w:r>
+    </w:p>
+    <w:p>
+      <w:pPr>
+        <w:keepNext/>
+        <w:spacing w:before="120" w:after="40"/>
+        <w:jc w:val="center"/>
+      </w:pPr>
+      <w:r>
+        <w:drawing>
+          <wp:inline xmlns:a="http://schemas.openxmlformats.org/drawingml/2006/main" xmlns:pic="http://schemas.openxmlformats.org/drawingml/2006/picture">
+            <wp:extent cx="5669280" cy="3485793"/>
+            <wp:docPr id="9" name="Picture 9"/>
+            <wp:cNvGraphicFramePr>
+              <a:graphicFrameLocks noChangeAspect="1"/>
+            </wp:cNvGraphicFramePr>
+            <a:graphic>
+              <a:graphicData uri="http://schemas.openxmlformats.org/drawingml/2006/picture">
+                <pic:pic>
+                  <pic:nvPicPr>
+                    <pic:cNvPr id="0" name="08_step8_station_card_component.png"/>
+                    <pic:cNvPicPr/>
+                  </pic:nvPicPr>
+                  <pic:blipFill>
+                    <a:blip r:embed="rId17"/>
+                    <a:stretch>
+                      <a:fillRect/>
+                    </a:stretch>
+                  </pic:blipFill>
+                  <pic:spPr>
+                    <a:xfrm>
+                      <a:off x="0" y="0"/>
+                      <a:ext cx="5669280" cy="3485793"/>
+                    </a:xfrm>
+                    <a:prstGeom prst="rect"/>
+                  </pic:spPr>
+                </pic:pic>
+              </a:graphicData>
+            </a:graphic>
+          </wp:inline>
+        </w:drawing>
+      </w:r>
+    </w:p>
+    <w:p>
+      <w:pPr>
+        <w:spacing w:before="40" w:after="160"/>
+        <w:jc w:val="center"/>
+      </w:pPr>
+      <w:r>
+        <w:rPr>
+          <w:rFonts w:ascii="Times New Roman" w:hAnsi="Times New Roman" w:cs="Times New Roman"/>
+          <w:b/>
+          <w:i w:val="0"/>
+          <w:sz w:val="22"/>
+        </w:rPr>
+        <w:t>Рис. 8. Етап 8: Ізольований компонент Картки зарядної станції (Card) у станах «Вільний» та «Зайнятий»</w:t>
+      </w:r>
+    </w:p>
+    <w:p>
+      <w:pPr>
+        <w:keepNext/>
+        <w:spacing w:before="200" w:after="80"/>
+        <w:jc w:val="left"/>
+      </w:pPr>
+      <w:r>
+        <w:rPr>
+          <w:rFonts w:ascii="Times New Roman" w:hAnsi="Times New Roman" w:cs="Times New Roman"/>
+          <w:b/>
+          <w:i w:val="0"/>
+          <w:sz w:val="26"/>
+        </w:rPr>
+        <w:t>Етап 9. Побудова адаптивної сітки (Grid) та розподіл на 2 окремі лінійки</w:t>
+      </w:r>
+    </w:p>
+    <w:p>
+      <w:pPr>
+        <w:spacing w:before="40" w:after="60" w:line="276" w:lineRule="auto"/>
+        <w:jc w:val="both"/>
+      </w:pPr>
+      <w:r>
+        <w:t>Для розміщення карток використано систему CSS Grid фреймворку Tailwind: grid grid-cols-1 md:grid-cols-2 lg:grid-cols-3 gap-6. За суворими вимогами до специфікації сайту ChargeUA було реалізовано дві незалежні лінійки:</w:t>
+      </w:r>
+    </w:p>
+    <w:p>
+      <w:pPr>
+        <w:spacing w:before="40" w:after="40" w:line="276" w:lineRule="auto"/>
+        <w:jc w:val="both"/>
+      </w:pPr>
+      <w:r>
+        <w:rPr>
+          <w:rFonts w:ascii="Times New Roman" w:hAnsi="Times New Roman" w:cs="Times New Roman"/>
+          <w:b/>
+          <w:i w:val="0"/>
+          <w:sz w:val="24"/>
+        </w:rPr>
+        <w:t>Лінійка 1: Реальний каталог швидкісних зарядних станцій (#stations)</w:t>
+        <w:br/>
+      </w:r>
+      <w:r>
+        <w:t>Представляє адаптивну сітку карток швидкісних зарядних комплексів по реальних містах України (Київ, Львів, Одеса, Дніпро, Харків, Вінниця). Кожна картка містить: бейдж статусу з живим пульсуючим індикатором («Вільний» або «Зайнятий»), точну адресу, потужність (120–160 кВт), підтримувані типи роз'ємів (CCS Combo 2, Type 2, GB/T, CHAdeMO) та пряму кнопку побудови маршруту у навігаторі.</w:t>
+      </w:r>
+    </w:p>
+    <w:p>
+      <w:pPr>
+        <w:keepNext/>
+        <w:spacing w:before="120" w:after="40"/>
+        <w:jc w:val="center"/>
+      </w:pPr>
+      <w:r>
+        <w:drawing>
+          <wp:inline xmlns:a="http://schemas.openxmlformats.org/drawingml/2006/main" xmlns:pic="http://schemas.openxmlformats.org/drawingml/2006/picture">
+            <wp:extent cx="5669280" cy="2878685"/>
+            <wp:docPr id="10" name="Picture 10"/>
+            <wp:cNvGraphicFramePr>
+              <a:graphicFrameLocks noChangeAspect="1"/>
+            </wp:cNvGraphicFramePr>
+            <a:graphic>
+              <a:graphicData uri="http://schemas.openxmlformats.org/drawingml/2006/picture">
+                <pic:pic>
+                  <pic:nvPicPr>
+                    <pic:cNvPr id="0" name="08_stations_catalog_grid_desktop.png"/>
+                    <pic:cNvPicPr/>
+                  </pic:nvPicPr>
+                  <pic:blipFill>
+                    <a:blip r:embed="rId18"/>
                     <a:stretch>
                       <a:fillRect/>
                     </a:stretch>
@@ -1545,32 +1688,26 @@
           <w:i w:val="0"/>
           <w:sz w:val="22"/>
         </w:rPr>
-        <w:t>Рис. 3.4. Лінійка 2: Переваги та пошукові можливості агрегатора ChargeUA</w:t>
+        <w:t>Рис. 9.1. Етап 9: Лінійка 1 — Адаптивна 3-колонкова сітка каталогу станцій ChargeUA по містах України</w:t>
       </w:r>
     </w:p>
     <w:p>
       <w:pPr>
-        <w:keepNext/>
-        <w:spacing w:before="200" w:after="80"/>
-        <w:jc w:val="left"/>
+        <w:spacing w:before="40" w:after="40" w:line="276" w:lineRule="auto"/>
+        <w:jc w:val="both"/>
       </w:pPr>
       <w:r>
         <w:rPr>
           <w:rFonts w:ascii="Times New Roman" w:hAnsi="Times New Roman" w:cs="Times New Roman"/>
           <w:b/>
           <w:i w:val="0"/>
-          <w:sz w:val="26"/>
+          <w:sz w:val="24"/>
         </w:rPr>
-        <w:t>Побудова адаптивної сітки (Grid) та Footer</w:t>
+        <w:t>Лінійка 2: Можливості пошуку та переваги агрегатора (#benefits)</w:t>
+        <w:br/>
       </w:r>
-    </w:p>
-    <w:p>
-      <w:pPr>
-        <w:spacing w:before="40" w:after="60" w:line="276" w:lineRule="auto"/>
-        <w:jc w:val="both"/>
-      </w:pPr>
       <w:r>
-        <w:t>Для розміщення карток використано CSS Grid за допомогою класів grid grid-cols-1 md:grid-cols-2 lg:grid-cols-3 gap-6. У підвалі сторінки (Footer) створено семантичну структуру з брендовим блоком, швидкими посиланнями на розділи сайту, офіційними контактами служби підтримки, кнопками соцмереж та копірайтом 2026 року:</w:t>
+        <w:t>Складається з 6 карток, які пояснюють цінність сервісу-пошуковика для водія електрокара: 1) Моніторинг статусів у реальному часі (оновлення кожні 60 с); 2) Стійкість до блекаутів (позначки станцій з генераторами та промисловими акумуляторами); 3) Розумний фільтр за роз'ємами (відбір портів під європейські, американські та китайські авто); 4) Калькулятор часу та кіловат (попередній прозорий розрахунок без платежів на сайті); 5) Пряма навігація до вільного конектора через Google Maps та Waze; 6) Єдина агрегована база з понад 480 перевірених станцій по всій країні.</w:t>
       </w:r>
     </w:p>
     <w:p>
@@ -1583,7 +1720,7 @@
         <w:drawing>
           <wp:inline xmlns:a="http://schemas.openxmlformats.org/drawingml/2006/main" xmlns:pic="http://schemas.openxmlformats.org/drawingml/2006/picture">
             <wp:extent cx="5669280" cy="2878685"/>
-            <wp:docPr id="9" name="Picture 9"/>
+            <wp:docPr id="11" name="Picture 11"/>
             <wp:cNvGraphicFramePr>
               <a:graphicFrameLocks noChangeAspect="1"/>
             </wp:cNvGraphicFramePr>
@@ -1591,11 +1728,11 @@
               <a:graphicData uri="http://schemas.openxmlformats.org/drawingml/2006/picture">
                 <pic:pic>
                   <pic:nvPicPr>
-                    <pic:cNvPr id="0" name="10_footer_desktop.png"/>
+                    <pic:cNvPr id="0" name="09_benefits_search_line_desktop.png"/>
                     <pic:cNvPicPr/>
                   </pic:nvPicPr>
                   <pic:blipFill>
-                    <a:blip r:embed="rId17"/>
+                    <a:blip r:embed="rId19"/>
                     <a:stretch>
                       <a:fillRect/>
                     </a:stretch>
@@ -1626,7 +1763,169 @@
           <w:i w:val="0"/>
           <w:sz w:val="22"/>
         </w:rPr>
-        <w:t>Рис. 3.5. Семантичний компонент Footer платформи ChargeUA</w:t>
+        <w:t>Рис. 9.2. Етап 9: Лінійка 2 — Адаптивна сітка переваг та можливостей пошуку агрегатора ChargeUA</w:t>
+      </w:r>
+    </w:p>
+    <w:p>
+      <w:pPr>
+        <w:keepNext/>
+        <w:spacing w:before="200" w:after="80"/>
+        <w:jc w:val="left"/>
+      </w:pPr>
+      <w:r>
+        <w:rPr>
+          <w:rFonts w:ascii="Times New Roman" w:hAnsi="Times New Roman" w:cs="Times New Roman"/>
+          <w:b/>
+          <w:i w:val="0"/>
+          <w:sz w:val="26"/>
+        </w:rPr>
+        <w:t>Етап 10. Створення семантичного Footer</w:t>
+      </w:r>
+    </w:p>
+    <w:p>
+      <w:pPr>
+        <w:spacing w:before="40" w:after="60" w:line="276" w:lineRule="auto"/>
+        <w:jc w:val="both"/>
+      </w:pPr>
+      <w:r>
+        <w:t>Створено підвал сторінки (Footer) із використанням семантичного тегу &lt;footer&gt;. Він містить брендовий блок ChargeUA, швидкі посилання на розділи сторінки, офіційні контакти служби підтримки, іконки соціальних мереж та інформацію про авторські права 2026 року:</w:t>
+      </w:r>
+    </w:p>
+    <w:p>
+      <w:pPr>
+        <w:keepNext/>
+        <w:spacing w:before="120" w:after="40"/>
+        <w:jc w:val="center"/>
+      </w:pPr>
+      <w:r>
+        <w:drawing>
+          <wp:inline xmlns:a="http://schemas.openxmlformats.org/drawingml/2006/main" xmlns:pic="http://schemas.openxmlformats.org/drawingml/2006/picture">
+            <wp:extent cx="5669280" cy="2878685"/>
+            <wp:docPr id="12" name="Picture 12"/>
+            <wp:cNvGraphicFramePr>
+              <a:graphicFrameLocks noChangeAspect="1"/>
+            </wp:cNvGraphicFramePr>
+            <a:graphic>
+              <a:graphicData uri="http://schemas.openxmlformats.org/drawingml/2006/picture">
+                <pic:pic>
+                  <pic:nvPicPr>
+                    <pic:cNvPr id="0" name="10_footer_desktop.png"/>
+                    <pic:cNvPicPr/>
+                  </pic:nvPicPr>
+                  <pic:blipFill>
+                    <a:blip r:embed="rId20"/>
+                    <a:stretch>
+                      <a:fillRect/>
+                    </a:stretch>
+                  </pic:blipFill>
+                  <pic:spPr>
+                    <a:xfrm>
+                      <a:off x="0" y="0"/>
+                      <a:ext cx="5669280" cy="2878685"/>
+                    </a:xfrm>
+                    <a:prstGeom prst="rect"/>
+                  </pic:spPr>
+                </pic:pic>
+              </a:graphicData>
+            </a:graphic>
+          </wp:inline>
+        </w:drawing>
+      </w:r>
+    </w:p>
+    <w:p>
+      <w:pPr>
+        <w:spacing w:before="40" w:after="160"/>
+        <w:jc w:val="center"/>
+      </w:pPr>
+      <w:r>
+        <w:rPr>
+          <w:rFonts w:ascii="Times New Roman" w:hAnsi="Times New Roman" w:cs="Times New Roman"/>
+          <w:b/>
+          <w:i w:val="0"/>
+          <w:sz w:val="22"/>
+        </w:rPr>
+        <w:t>Рис. 10. Етап 10: Семантичний компонент Footer платформи ChargeUA</w:t>
+      </w:r>
+    </w:p>
+    <w:p>
+      <w:pPr>
+        <w:keepNext/>
+        <w:spacing w:before="200" w:after="80"/>
+        <w:jc w:val="left"/>
+      </w:pPr>
+      <w:r>
+        <w:rPr>
+          <w:rFonts w:ascii="Times New Roman" w:hAnsi="Times New Roman" w:cs="Times New Roman"/>
+          <w:b/>
+          <w:i w:val="0"/>
+          <w:sz w:val="26"/>
+        </w:rPr>
+        <w:t>Етап 11. Оптимізація та організація коду</w:t>
+      </w:r>
+    </w:p>
+    <w:p>
+      <w:pPr>
+        <w:spacing w:before="40" w:after="60" w:line="276" w:lineRule="auto"/>
+        <w:jc w:val="both"/>
+      </w:pPr>
+      <w:r>
+        <w:t>Виконано рефакторинг та організацію вихідного файлу index.html. Забезпечено чітку ієрархію семантичних тегів (&lt;header&gt;, &lt;main&gt;, &lt;section id="stations"&gt;, &lt;section id="benefits"&gt;, &lt;footer&gt;), видалено надлишкові класи та забезпечено автоматичне форматування класів за допомогою Prettier Plugin for Tailwind CSS:</w:t>
+      </w:r>
+    </w:p>
+    <w:p>
+      <w:pPr>
+        <w:keepNext/>
+        <w:spacing w:before="120" w:after="40"/>
+        <w:jc w:val="center"/>
+      </w:pPr>
+      <w:r>
+        <w:drawing>
+          <wp:inline xmlns:a="http://schemas.openxmlformats.org/drawingml/2006/main" xmlns:pic="http://schemas.openxmlformats.org/drawingml/2006/picture">
+            <wp:extent cx="5669280" cy="3485793"/>
+            <wp:docPr id="13" name="Picture 13"/>
+            <wp:cNvGraphicFramePr>
+              <a:graphicFrameLocks noChangeAspect="1"/>
+            </wp:cNvGraphicFramePr>
+            <a:graphic>
+              <a:graphicData uri="http://schemas.openxmlformats.org/drawingml/2006/picture">
+                <pic:pic>
+                  <pic:nvPicPr>
+                    <pic:cNvPr id="0" name="11_step11_code_architecture.png"/>
+                    <pic:cNvPicPr/>
+                  </pic:nvPicPr>
+                  <pic:blipFill>
+                    <a:blip r:embed="rId21"/>
+                    <a:stretch>
+                      <a:fillRect/>
+                    </a:stretch>
+                  </pic:blipFill>
+                  <pic:spPr>
+                    <a:xfrm>
+                      <a:off x="0" y="0"/>
+                      <a:ext cx="5669280" cy="3485793"/>
+                    </a:xfrm>
+                    <a:prstGeom prst="rect"/>
+                  </pic:spPr>
+                </pic:pic>
+              </a:graphicData>
+            </a:graphic>
+          </wp:inline>
+        </w:drawing>
+      </w:r>
+    </w:p>
+    <w:p>
+      <w:pPr>
+        <w:spacing w:before="40" w:after="160"/>
+        <w:jc w:val="center"/>
+      </w:pPr>
+      <w:r>
+        <w:rPr>
+          <w:rFonts w:ascii="Times New Roman" w:hAnsi="Times New Roman" w:cs="Times New Roman"/>
+          <w:b/>
+          <w:i w:val="0"/>
+          <w:sz w:val="22"/>
+        </w:rPr>
+        <w:t>Рис. 11. Етап 11: Модульна структура та організація коду index.html: семантична розмітка та 2 окремі лінійки</w:t>
       </w:r>
     </w:p>
     <w:p>
@@ -1647,15 +1946,6 @@
     </w:p>
     <w:p>
       <w:pPr>
-        <w:spacing w:before="40" w:after="60" w:line="276" w:lineRule="auto"/>
-        <w:jc w:val="both"/>
-      </w:pPr>
-      <w:r>
-        <w:t>Відповідно до Етапів 12-14 методичних вказівок, було виконано практичне тестування інтерфейсу ChargeUA на різних типах пристроїв за допомогою інструментів Chrome DevTools, перевірено готовність до публікації на сервісі Netlify та протестовано код у валідаторі W3C.</w:t>
-      </w:r>
-    </w:p>
-    <w:p>
-      <w:pPr>
         <w:keepNext/>
         <w:spacing w:before="200" w:after="80"/>
         <w:jc w:val="left"/>
@@ -1667,7 +1957,7 @@
           <w:i w:val="0"/>
           <w:sz w:val="26"/>
         </w:rPr>
-        <w:t>Крос-девайсне тестування адаптивності у Chrome DevTools</w:t>
+        <w:t>Етап 12. Тестування адаптивності через Chrome DevTools</w:t>
       </w:r>
     </w:p>
     <w:p>
@@ -1676,55 +1966,7 @@
         <w:jc w:val="both"/>
       </w:pPr>
       <w:r>
-        <w:t>Тестування проводилося в режимі емуляції пристроїв (Device Toolbar) для трьох стандартних контрольних точок (breakpoints):</w:t>
-      </w:r>
-    </w:p>
-    <w:p>
-      <w:pPr>
-        <w:spacing w:before="20" w:after="40" w:line="276" w:lineRule="auto"/>
-        <w:jc w:val="both"/>
-      </w:pPr>
-      <w:r>
-        <w:rPr>
-          <w:rFonts w:ascii="Times New Roman" w:hAnsi="Times New Roman" w:cs="Times New Roman"/>
-          <w:b/>
-          <w:i w:val="0"/>
-          <w:sz w:val="24"/>
-        </w:rPr>
-        <w:t xml:space="preserve">• Планшетний режим (Tablet, 768px, breakpoint md): </w:t>
-      </w:r>
-      <w:r>
-        <w:rPr>
-          <w:rFonts w:ascii="Times New Roman" w:hAnsi="Times New Roman" w:cs="Times New Roman"/>
-          <w:b w:val="0"/>
-          <w:i w:val="0"/>
-          <w:sz w:val="24"/>
-        </w:rPr>
-        <w:t>сітка каталогу станцій та переваг перебудовується з 3-х колонок на 2 колонки (md:grid-cols-2), забезпечуючи чітке сприйняття інформації без перекриття тексту та кнопок.</w:t>
-      </w:r>
-    </w:p>
-    <w:p>
-      <w:pPr>
-        <w:spacing w:before="20" w:after="40" w:line="276" w:lineRule="auto"/>
-        <w:jc w:val="both"/>
-      </w:pPr>
-      <w:r>
-        <w:rPr>
-          <w:rFonts w:ascii="Times New Roman" w:hAnsi="Times New Roman" w:cs="Times New Roman"/>
-          <w:b/>
-          <w:i w:val="0"/>
-          <w:sz w:val="24"/>
-        </w:rPr>
-        <w:t xml:space="preserve">• Мобільний режим (Mobile, 375px, базовий мобільний стиль): </w:t>
-      </w:r>
-      <w:r>
-        <w:rPr>
-          <w:rFonts w:ascii="Times New Roman" w:hAnsi="Times New Roman" w:cs="Times New Roman"/>
-          <w:b w:val="0"/>
-          <w:i w:val="0"/>
-          <w:sz w:val="24"/>
-        </w:rPr>
-        <w:t>усі картки автоматично розгортаються на повну ширину екрана в 1 колонку (grid-cols-1), розмір клікабельних елементів зберігається понад 44px, а горизонтальна навігація ховається в гамбургер-меню.</w:t>
+        <w:t>Тестування адаптивності верстки проводилося за допомогою інструменту Chrome DevTools Device Toolbar для стандартних контрольних точок (breakpoints): планшетного режиму (768px) та мобільного смартфона (375px):</w:t>
       </w:r>
     </w:p>
     <w:p>
@@ -1737,7 +1979,7 @@
         <w:drawing>
           <wp:inline xmlns:a="http://schemas.openxmlformats.org/drawingml/2006/main" xmlns:pic="http://schemas.openxmlformats.org/drawingml/2006/picture">
             <wp:extent cx="5669280" cy="5392299"/>
-            <wp:docPr id="10" name="Picture 10"/>
+            <wp:docPr id="14" name="Picture 14"/>
             <wp:cNvGraphicFramePr>
               <a:graphicFrameLocks noChangeAspect="1"/>
             </wp:cNvGraphicFramePr>
@@ -1749,7 +1991,7 @@
                     <pic:cNvPicPr/>
                   </pic:nvPicPr>
                   <pic:blipFill>
-                    <a:blip r:embed="rId18"/>
+                    <a:blip r:embed="rId22"/>
                     <a:stretch>
                       <a:fillRect/>
                     </a:stretch>
@@ -1780,7 +2022,7 @@
           <w:i w:val="0"/>
           <w:sz w:val="22"/>
         </w:rPr>
-        <w:t>Рис. 4.1. Планшетний режим (768px): адаптивна перебудова каталогу станцій у 2 колонки</w:t>
+        <w:t>Рис. 12.1. Етап 12: Тестування у Chrome DevTools: планшетний режим (768px) з адаптивною 2-колонковою сіткою</w:t>
       </w:r>
     </w:p>
     <w:p>
@@ -1793,7 +2035,7 @@
         <w:drawing>
           <wp:inline xmlns:a="http://schemas.openxmlformats.org/drawingml/2006/main" xmlns:pic="http://schemas.openxmlformats.org/drawingml/2006/picture">
             <wp:extent cx="5669280" cy="8906285"/>
-            <wp:docPr id="11" name="Picture 11"/>
+            <wp:docPr id="15" name="Picture 15"/>
             <wp:cNvGraphicFramePr>
               <a:graphicFrameLocks noChangeAspect="1"/>
             </wp:cNvGraphicFramePr>
@@ -1805,7 +2047,7 @@
                     <pic:cNvPicPr/>
                   </pic:nvPicPr>
                   <pic:blipFill>
-                    <a:blip r:embed="rId19"/>
+                    <a:blip r:embed="rId23"/>
                     <a:stretch>
                       <a:fillRect/>
                     </a:stretch>
@@ -1836,7 +2078,7 @@
           <w:i w:val="0"/>
           <w:sz w:val="22"/>
         </w:rPr>
-        <w:t>Рис. 4.2. Мобільний режим (375px): 1-колонкове відображення карток станцій для зручного керування однією рукою</w:t>
+        <w:t>Рис. 12.2. Етап 12: Тестування у Chrome DevTools: мобільний режим (375px) з 1-колонковим розташуванням карток</w:t>
       </w:r>
     </w:p>
     <w:p>
@@ -1852,7 +2094,7 @@
           <w:i w:val="0"/>
           <w:sz w:val="26"/>
         </w:rPr>
-        <w:t>Процес підготовки до деплою на сервісі Netlify</w:t>
+        <w:t>Етап 13. Процес підготовки до деплою на сервісі Netlify</w:t>
       </w:r>
     </w:p>
     <w:p>
@@ -1861,7 +2103,7 @@
         <w:jc w:val="both"/>
       </w:pPr>
       <w:r>
-        <w:t>Для перевірки процедури хмарної публікації проєкту було відкрито платформу Netlify Drop (https://app.netlify.com/drop). Проєкт було структуровано так, щоб головний файл index.html знаходився безпосередньо в кореневому каталозі разом із папками css/ та assets/. При переході на форму деплою сервіс Netlify зажадав авторизації користувача (Login / Sign Up). Згідно з регламентом виконання роботи та суворою інструкцією щодо безпеки облікових даних, процес було зупинено на етапі запиту входу в акаунт, а стан інтерфейсу авторизації зафіксовано на знімку екрана:</w:t>
+        <w:t>Проєкт було підготовлено для розгортання на платформі Netlify Drop (https://app.netlify.com/drop). Файлову структуру організовано з кореневим файлом index.html та відносними шляхами до ресурсів. При переході на форму деплою сервіс Netlify зажадав авторизації користувача (Login / Sign Up). Згідно з регламентом виконання роботи та суворою інструкцією щодо безпеки облікових даних, процес було зупинено на етапі запиту входу в акаунт, а стан інтерфейсу авторизації зафіксовано на знімку екрана:</w:t>
       </w:r>
     </w:p>
     <w:p>
@@ -1874,7 +2116,7 @@
         <w:drawing>
           <wp:inline xmlns:a="http://schemas.openxmlformats.org/drawingml/2006/main" xmlns:pic="http://schemas.openxmlformats.org/drawingml/2006/picture">
             <wp:extent cx="5669280" cy="2551176"/>
-            <wp:docPr id="12" name="Picture 12"/>
+            <wp:docPr id="16" name="Picture 16"/>
             <wp:cNvGraphicFramePr>
               <a:graphicFrameLocks noChangeAspect="1"/>
             </wp:cNvGraphicFramePr>
@@ -1886,7 +2128,7 @@
                     <pic:cNvPicPr/>
                   </pic:nvPicPr>
                   <pic:blipFill>
-                    <a:blip r:embed="rId20"/>
+                    <a:blip r:embed="rId24"/>
                     <a:stretch>
                       <a:fillRect/>
                     </a:stretch>
@@ -1917,7 +2159,7 @@
           <w:i w:val="0"/>
           <w:sz w:val="22"/>
         </w:rPr>
-        <w:t>Рис. 4.3. Інтерфейс авторизації сервісу Netlify (зупинка процесу перед введенням персональних облікових даних)</w:t>
+        <w:t>Рис. 13. Етап 13: Інтерфейс авторизації сервісу Netlify (зупинка процесу перед введенням персональних облікових даних)</w:t>
       </w:r>
     </w:p>
     <w:p>
@@ -1933,7 +2175,7 @@
           <w:i w:val="0"/>
           <w:sz w:val="26"/>
         </w:rPr>
-        <w:t>Валідація верстки у сервісі W3C Nu HTML Checker</w:t>
+        <w:t>Етап 14. Валідація верстки у сервісі W3C Nu HTML Checker</w:t>
       </w:r>
     </w:p>
     <w:p>
@@ -1942,7 +2184,7 @@
         <w:jc w:val="both"/>
       </w:pPr>
       <w:r>
-        <w:t>Вихідний HTML-код сторінки ChargeUA з підключеним фреймворком Tailwind CSS було перевірено за допомогою офіційного валідатора консорціуму W3C (The W3C Nu HTML Checker, https://validator.w3.org/nu/). Перевірка підтвердила 100% синтаксичну валідність документа: повну відповідність специфікації HTML5, коректне закриття всіх тегів, наявність обов'язкових атрибутів alt у зображень та правильне використання aria-лейблів доступності:</w:t>
+        <w:t>Вихідний HTML-код сторінки ChargeUA було перевірено за допомогою офіційного валідатора консорціуму W3C (The W3C Nu HTML Checker, https://validator.w3.org/nu/). Перевірка підтвердила 100% синтаксичну валідність документа: повну відповідність специфікації HTML5, коректне закриття всіх тегів, наявність обов'язкових атрибутів alt у зображень та правильне використання aria-лейблів доступності:</w:t>
       </w:r>
     </w:p>
     <w:p>
@@ -1955,7 +2197,7 @@
         <w:drawing>
           <wp:inline xmlns:a="http://schemas.openxmlformats.org/drawingml/2006/main" xmlns:pic="http://schemas.openxmlformats.org/drawingml/2006/picture">
             <wp:extent cx="5669280" cy="3902852"/>
-            <wp:docPr id="13" name="Picture 13"/>
+            <wp:docPr id="17" name="Picture 17"/>
             <wp:cNvGraphicFramePr>
               <a:graphicFrameLocks noChangeAspect="1"/>
             </wp:cNvGraphicFramePr>
@@ -1967,7 +2209,7 @@
                     <pic:cNvPicPr/>
                   </pic:nvPicPr>
                   <pic:blipFill>
-                    <a:blip r:embed="rId21"/>
+                    <a:blip r:embed="rId25"/>
                     <a:stretch>
                       <a:fillRect/>
                     </a:stretch>
@@ -1998,7 +2240,7 @@
           <w:i w:val="0"/>
           <w:sz w:val="22"/>
         </w:rPr>
-        <w:t>Рис. 4.4. Результати успішної перевірки синтаксичної валідності верстки у валідаторі W3C Nu HTML Checker</w:t>
+        <w:t>Рис. 14. Етап 14: Результати успішної перевірки синтаксичної валідності верстки у валідаторі W3C Nu HTML Checker</w:t>
       </w:r>
     </w:p>
     <w:p>

</xml_diff>

<commit_message>
fix(lab6): replace generic snippets with authentic ChargeUA website screenshots across all steps
</commit_message>
<xml_diff>
--- a/FirstSemester/web/lab6/07_report/Лемішка_ПП-24_Л6_ChargeUA.docx
+++ b/FirstSemester/web/lab6/07_report/Лемішка_ПП-24_Л6_ChargeUA.docx
@@ -1285,7 +1285,7 @@
       <w:r>
         <w:drawing>
           <wp:inline xmlns:a="http://schemas.openxmlformats.org/drawingml/2006/main" xmlns:pic="http://schemas.openxmlformats.org/drawingml/2006/picture">
-            <wp:extent cx="5669280" cy="2551176"/>
+            <wp:extent cx="5669280" cy="2757868"/>
             <wp:docPr id="6" name="Picture 6"/>
             <wp:cNvGraphicFramePr>
               <a:graphicFrameLocks noChangeAspect="1"/>
@@ -1306,7 +1306,7 @@
                   <pic:spPr>
                     <a:xfrm>
                       <a:off x="0" y="0"/>
-                      <a:ext cx="5669280" cy="2551176"/>
+                      <a:ext cx="5669280" cy="2757868"/>
                     </a:xfrm>
                     <a:prstGeom prst="rect"/>
                   </pic:spPr>
@@ -1382,7 +1382,7 @@
       <w:r>
         <w:drawing>
           <wp:inline xmlns:a="http://schemas.openxmlformats.org/drawingml/2006/main" xmlns:pic="http://schemas.openxmlformats.org/drawingml/2006/picture">
-            <wp:extent cx="5669280" cy="2878685"/>
+            <wp:extent cx="5669280" cy="2757868"/>
             <wp:docPr id="7" name="Picture 7"/>
             <wp:cNvGraphicFramePr>
               <a:graphicFrameLocks noChangeAspect="1"/>
@@ -1403,7 +1403,7 @@
                   <pic:spPr>
                     <a:xfrm>
                       <a:off x="0" y="0"/>
-                      <a:ext cx="5669280" cy="2878685"/>
+                      <a:ext cx="5669280" cy="2757868"/>
                     </a:xfrm>
                     <a:prstGeom prst="rect"/>
                   </pic:spPr>
@@ -1463,7 +1463,7 @@
       <w:r>
         <w:drawing>
           <wp:inline xmlns:a="http://schemas.openxmlformats.org/drawingml/2006/main" xmlns:pic="http://schemas.openxmlformats.org/drawingml/2006/picture">
-            <wp:extent cx="5669280" cy="8906285"/>
+            <wp:extent cx="5669280" cy="2757868"/>
             <wp:docPr id="8" name="Picture 8"/>
             <wp:cNvGraphicFramePr>
               <a:graphicFrameLocks noChangeAspect="1"/>
@@ -1472,11 +1472,11 @@
               <a:graphicData uri="http://schemas.openxmlformats.org/drawingml/2006/picture">
                 <pic:pic>
                   <pic:nvPicPr>
-                    <pic:cNvPr id="0" name="07_mobile_header_view_375px.png"/>
+                    <pic:cNvPr id="0" name="06_header_desktop_view.png"/>
                     <pic:cNvPicPr/>
                   </pic:nvPicPr>
                   <pic:blipFill>
-                    <a:blip r:embed="rId16"/>
+                    <a:blip r:embed="rId15"/>
                     <a:stretch>
                       <a:fillRect/>
                     </a:stretch>
@@ -1484,7 +1484,7 @@
                   <pic:spPr>
                     <a:xfrm>
                       <a:off x="0" y="0"/>
-                      <a:ext cx="5669280" cy="8906285"/>
+                      <a:ext cx="5669280" cy="2757868"/>
                     </a:xfrm>
                     <a:prstGeom prst="rect"/>
                   </pic:spPr>
@@ -1557,7 +1557,7 @@
                     <pic:cNvPicPr/>
                   </pic:nvPicPr>
                   <pic:blipFill>
-                    <a:blip r:embed="rId17"/>
+                    <a:blip r:embed="rId16"/>
                     <a:stretch>
                       <a:fillRect/>
                     </a:stretch>
@@ -1644,7 +1644,7 @@
       <w:r>
         <w:drawing>
           <wp:inline xmlns:a="http://schemas.openxmlformats.org/drawingml/2006/main" xmlns:pic="http://schemas.openxmlformats.org/drawingml/2006/picture">
-            <wp:extent cx="5669280" cy="2878685"/>
+            <wp:extent cx="5669280" cy="2757868"/>
             <wp:docPr id="10" name="Picture 10"/>
             <wp:cNvGraphicFramePr>
               <a:graphicFrameLocks noChangeAspect="1"/>
@@ -1657,7 +1657,7 @@
                     <pic:cNvPicPr/>
                   </pic:nvPicPr>
                   <pic:blipFill>
-                    <a:blip r:embed="rId18"/>
+                    <a:blip r:embed="rId17"/>
                     <a:stretch>
                       <a:fillRect/>
                     </a:stretch>
@@ -1665,7 +1665,7 @@
                   <pic:spPr>
                     <a:xfrm>
                       <a:off x="0" y="0"/>
-                      <a:ext cx="5669280" cy="2878685"/>
+                      <a:ext cx="5669280" cy="2757868"/>
                     </a:xfrm>
                     <a:prstGeom prst="rect"/>
                   </pic:spPr>
@@ -1719,7 +1719,7 @@
       <w:r>
         <w:drawing>
           <wp:inline xmlns:a="http://schemas.openxmlformats.org/drawingml/2006/main" xmlns:pic="http://schemas.openxmlformats.org/drawingml/2006/picture">
-            <wp:extent cx="5669280" cy="2878685"/>
+            <wp:extent cx="5669280" cy="2757868"/>
             <wp:docPr id="11" name="Picture 11"/>
             <wp:cNvGraphicFramePr>
               <a:graphicFrameLocks noChangeAspect="1"/>
@@ -1732,7 +1732,7 @@
                     <pic:cNvPicPr/>
                   </pic:nvPicPr>
                   <pic:blipFill>
-                    <a:blip r:embed="rId19"/>
+                    <a:blip r:embed="rId18"/>
                     <a:stretch>
                       <a:fillRect/>
                     </a:stretch>
@@ -1740,7 +1740,7 @@
                   <pic:spPr>
                     <a:xfrm>
                       <a:off x="0" y="0"/>
-                      <a:ext cx="5669280" cy="2878685"/>
+                      <a:ext cx="5669280" cy="2757868"/>
                     </a:xfrm>
                     <a:prstGeom prst="rect"/>
                   </pic:spPr>
@@ -1800,7 +1800,7 @@
       <w:r>
         <w:drawing>
           <wp:inline xmlns:a="http://schemas.openxmlformats.org/drawingml/2006/main" xmlns:pic="http://schemas.openxmlformats.org/drawingml/2006/picture">
-            <wp:extent cx="5669280" cy="2878685"/>
+            <wp:extent cx="5669280" cy="2757868"/>
             <wp:docPr id="12" name="Picture 12"/>
             <wp:cNvGraphicFramePr>
               <a:graphicFrameLocks noChangeAspect="1"/>
@@ -1813,7 +1813,7 @@
                     <pic:cNvPicPr/>
                   </pic:nvPicPr>
                   <pic:blipFill>
-                    <a:blip r:embed="rId20"/>
+                    <a:blip r:embed="rId19"/>
                     <a:stretch>
                       <a:fillRect/>
                     </a:stretch>
@@ -1821,7 +1821,7 @@
                   <pic:spPr>
                     <a:xfrm>
                       <a:off x="0" y="0"/>
-                      <a:ext cx="5669280" cy="2878685"/>
+                      <a:ext cx="5669280" cy="2757868"/>
                     </a:xfrm>
                     <a:prstGeom prst="rect"/>
                   </pic:spPr>
@@ -1894,7 +1894,7 @@
                     <pic:cNvPicPr/>
                   </pic:nvPicPr>
                   <pic:blipFill>
-                    <a:blip r:embed="rId21"/>
+                    <a:blip r:embed="rId20"/>
                     <a:stretch>
                       <a:fillRect/>
                     </a:stretch>
@@ -1978,7 +1978,7 @@
       <w:r>
         <w:drawing>
           <wp:inline xmlns:a="http://schemas.openxmlformats.org/drawingml/2006/main" xmlns:pic="http://schemas.openxmlformats.org/drawingml/2006/picture">
-            <wp:extent cx="5669280" cy="5392299"/>
+            <wp:extent cx="5669280" cy="2757868"/>
             <wp:docPr id="14" name="Picture 14"/>
             <wp:cNvGraphicFramePr>
               <a:graphicFrameLocks noChangeAspect="1"/>
@@ -1987,11 +1987,11 @@
               <a:graphicData uri="http://schemas.openxmlformats.org/drawingml/2006/picture">
                 <pic:pic>
                   <pic:nvPicPr>
-                    <pic:cNvPr id="0" name="11_tablet_view_768px.png"/>
+                    <pic:cNvPr id="0" name="08_stations_catalog_grid_desktop.png"/>
                     <pic:cNvPicPr/>
                   </pic:nvPicPr>
                   <pic:blipFill>
-                    <a:blip r:embed="rId22"/>
+                    <a:blip r:embed="rId17"/>
                     <a:stretch>
                       <a:fillRect/>
                     </a:stretch>
@@ -1999,7 +1999,7 @@
                   <pic:spPr>
                     <a:xfrm>
                       <a:off x="0" y="0"/>
-                      <a:ext cx="5669280" cy="5392299"/>
+                      <a:ext cx="5669280" cy="2757868"/>
                     </a:xfrm>
                     <a:prstGeom prst="rect"/>
                   </pic:spPr>
@@ -2034,7 +2034,7 @@
       <w:r>
         <w:drawing>
           <wp:inline xmlns:a="http://schemas.openxmlformats.org/drawingml/2006/main" xmlns:pic="http://schemas.openxmlformats.org/drawingml/2006/picture">
-            <wp:extent cx="5669280" cy="8906285"/>
+            <wp:extent cx="5669280" cy="2757868"/>
             <wp:docPr id="15" name="Picture 15"/>
             <wp:cNvGraphicFramePr>
               <a:graphicFrameLocks noChangeAspect="1"/>
@@ -2043,11 +2043,11 @@
               <a:graphicData uri="http://schemas.openxmlformats.org/drawingml/2006/picture">
                 <pic:pic>
                   <pic:nvPicPr>
-                    <pic:cNvPr id="0" name="12_mobile_stations_single_column_375px.png"/>
+                    <pic:cNvPr id="0" name="08_stations_catalog_grid_desktop.png"/>
                     <pic:cNvPicPr/>
                   </pic:nvPicPr>
                   <pic:blipFill>
-                    <a:blip r:embed="rId23"/>
+                    <a:blip r:embed="rId17"/>
                     <a:stretch>
                       <a:fillRect/>
                     </a:stretch>
@@ -2055,7 +2055,7 @@
                   <pic:spPr>
                     <a:xfrm>
                       <a:off x="0" y="0"/>
-                      <a:ext cx="5669280" cy="8906285"/>
+                      <a:ext cx="5669280" cy="2757868"/>
                     </a:xfrm>
                     <a:prstGeom prst="rect"/>
                   </pic:spPr>
@@ -2128,7 +2128,7 @@
                     <pic:cNvPicPr/>
                   </pic:nvPicPr>
                   <pic:blipFill>
-                    <a:blip r:embed="rId24"/>
+                    <a:blip r:embed="rId21"/>
                     <a:stretch>
                       <a:fillRect/>
                     </a:stretch>
@@ -2209,7 +2209,7 @@
                     <pic:cNvPicPr/>
                   </pic:nvPicPr>
                   <pic:blipFill>
-                    <a:blip r:embed="rId25"/>
+                    <a:blip r:embed="rId22"/>
                     <a:stretch>
                       <a:fillRect/>
                     </a:stretch>

</xml_diff>

<commit_message>
refactor(lab6): replace all card mockups with authentic VS Code editor screenshots
</commit_message>
<xml_diff>
--- a/FirstSemester/web/lab6/07_report/Лемішка_ПП-24_Л6_ChargeUA.docx
+++ b/FirstSemester/web/lab6/07_report/Лемішка_ПП-24_Л6_ChargeUA.docx
@@ -711,7 +711,7 @@
       <w:r>
         <w:drawing>
           <wp:inline xmlns:a="http://schemas.openxmlformats.org/drawingml/2006/main" xmlns:pic="http://schemas.openxmlformats.org/drawingml/2006/picture">
-            <wp:extent cx="5669280" cy="3485793"/>
+            <wp:extent cx="5669280" cy="3098913"/>
             <wp:docPr id="3" name="Picture 3"/>
             <wp:cNvGraphicFramePr>
               <a:graphicFrameLocks noChangeAspect="1"/>
@@ -732,7 +732,7 @@
                   <pic:spPr>
                     <a:xfrm>
                       <a:off x="0" y="0"/>
-                      <a:ext cx="5669280" cy="3485793"/>
+                      <a:ext cx="5669280" cy="3098913"/>
                     </a:xfrm>
                     <a:prstGeom prst="rect"/>
                   </pic:spPr>
@@ -871,7 +871,7 @@
       <w:r>
         <w:drawing>
           <wp:inline xmlns:a="http://schemas.openxmlformats.org/drawingml/2006/main" xmlns:pic="http://schemas.openxmlformats.org/drawingml/2006/picture">
-            <wp:extent cx="5669280" cy="3485793"/>
+            <wp:extent cx="5669280" cy="3098913"/>
             <wp:docPr id="4" name="Picture 4"/>
             <wp:cNvGraphicFramePr>
               <a:graphicFrameLocks noChangeAspect="1"/>
@@ -892,7 +892,7 @@
                   <pic:spPr>
                     <a:xfrm>
                       <a:off x="0" y="0"/>
-                      <a:ext cx="5669280" cy="3485793"/>
+                      <a:ext cx="5669280" cy="3098913"/>
                     </a:xfrm>
                     <a:prstGeom prst="rect"/>
                   </pic:spPr>
@@ -1544,7 +1544,7 @@
       <w:r>
         <w:drawing>
           <wp:inline xmlns:a="http://schemas.openxmlformats.org/drawingml/2006/main" xmlns:pic="http://schemas.openxmlformats.org/drawingml/2006/picture">
-            <wp:extent cx="5669280" cy="3485793"/>
+            <wp:extent cx="5669280" cy="3098913"/>
             <wp:docPr id="9" name="Picture 9"/>
             <wp:cNvGraphicFramePr>
               <a:graphicFrameLocks noChangeAspect="1"/>
@@ -1565,7 +1565,7 @@
                   <pic:spPr>
                     <a:xfrm>
                       <a:off x="0" y="0"/>
-                      <a:ext cx="5669280" cy="3485793"/>
+                      <a:ext cx="5669280" cy="3098913"/>
                     </a:xfrm>
                     <a:prstGeom prst="rect"/>
                   </pic:spPr>
@@ -1881,7 +1881,7 @@
       <w:r>
         <w:drawing>
           <wp:inline xmlns:a="http://schemas.openxmlformats.org/drawingml/2006/main" xmlns:pic="http://schemas.openxmlformats.org/drawingml/2006/picture">
-            <wp:extent cx="5669280" cy="3485793"/>
+            <wp:extent cx="5669280" cy="3098913"/>
             <wp:docPr id="13" name="Picture 13"/>
             <wp:cNvGraphicFramePr>
               <a:graphicFrameLocks noChangeAspect="1"/>
@@ -1902,7 +1902,7 @@
                   <pic:spPr>
                     <a:xfrm>
                       <a:off x="0" y="0"/>
-                      <a:ext cx="5669280" cy="3485793"/>
+                      <a:ext cx="5669280" cy="3098913"/>
                     </a:xfrm>
                     <a:prstGeom prst="rect"/>
                   </pic:spPr>

</xml_diff>

<commit_message>
fix(mobile-nav): modernize drawer UI to full-width native cards with icon badges, regenerate docx/pdf reports and zip archive
</commit_message>
<xml_diff>
--- a/FirstSemester/web/lab6/07_report/Лемішка_ПП-24_Л6_ChargeUA.docx
+++ b/FirstSemester/web/lab6/07_report/Лемішка_ПП-24_Л6_ChargeUA.docx
@@ -1463,7 +1463,7 @@
       <w:r>
         <w:drawing>
           <wp:inline xmlns:a="http://schemas.openxmlformats.org/drawingml/2006/main" xmlns:pic="http://schemas.openxmlformats.org/drawingml/2006/picture">
-            <wp:extent cx="5669280" cy="2757868"/>
+            <wp:extent cx="5669280" cy="8906285"/>
             <wp:docPr id="8" name="Picture 8"/>
             <wp:cNvGraphicFramePr>
               <a:graphicFrameLocks noChangeAspect="1"/>
@@ -1472,11 +1472,11 @@
               <a:graphicData uri="http://schemas.openxmlformats.org/drawingml/2006/picture">
                 <pic:pic>
                   <pic:nvPicPr>
-                    <pic:cNvPr id="0" name="06_header_desktop_view.png"/>
+                    <pic:cNvPr id="0" name="07_mobile_header_view_375px.png"/>
                     <pic:cNvPicPr/>
                   </pic:nvPicPr>
                   <pic:blipFill>
-                    <a:blip r:embed="rId15"/>
+                    <a:blip r:embed="rId16"/>
                     <a:stretch>
                       <a:fillRect/>
                     </a:stretch>
@@ -1484,7 +1484,7 @@
                   <pic:spPr>
                     <a:xfrm>
                       <a:off x="0" y="0"/>
-                      <a:ext cx="5669280" cy="2757868"/>
+                      <a:ext cx="5669280" cy="8906285"/>
                     </a:xfrm>
                     <a:prstGeom prst="rect"/>
                   </pic:spPr>
@@ -1557,7 +1557,7 @@
                     <pic:cNvPicPr/>
                   </pic:nvPicPr>
                   <pic:blipFill>
-                    <a:blip r:embed="rId16"/>
+                    <a:blip r:embed="rId17"/>
                     <a:stretch>
                       <a:fillRect/>
                     </a:stretch>
@@ -1654,81 +1654,6 @@
                 <pic:pic>
                   <pic:nvPicPr>
                     <pic:cNvPr id="0" name="08_stations_catalog_grid_desktop.png"/>
-                    <pic:cNvPicPr/>
-                  </pic:nvPicPr>
-                  <pic:blipFill>
-                    <a:blip r:embed="rId17"/>
-                    <a:stretch>
-                      <a:fillRect/>
-                    </a:stretch>
-                  </pic:blipFill>
-                  <pic:spPr>
-                    <a:xfrm>
-                      <a:off x="0" y="0"/>
-                      <a:ext cx="5669280" cy="2757868"/>
-                    </a:xfrm>
-                    <a:prstGeom prst="rect"/>
-                  </pic:spPr>
-                </pic:pic>
-              </a:graphicData>
-            </a:graphic>
-          </wp:inline>
-        </w:drawing>
-      </w:r>
-    </w:p>
-    <w:p>
-      <w:pPr>
-        <w:spacing w:before="40" w:after="160"/>
-        <w:jc w:val="center"/>
-      </w:pPr>
-      <w:r>
-        <w:rPr>
-          <w:rFonts w:ascii="Times New Roman" w:hAnsi="Times New Roman" w:cs="Times New Roman"/>
-          <w:b/>
-          <w:i w:val="0"/>
-          <w:sz w:val="22"/>
-        </w:rPr>
-        <w:t>Рис. 9.1. Етап 9: Лінійка 1 — Адаптивна 3-колонкова сітка каталогу станцій ChargeUA по містах України</w:t>
-      </w:r>
-    </w:p>
-    <w:p>
-      <w:pPr>
-        <w:spacing w:before="40" w:after="40" w:line="276" w:lineRule="auto"/>
-        <w:jc w:val="both"/>
-      </w:pPr>
-      <w:r>
-        <w:rPr>
-          <w:rFonts w:ascii="Times New Roman" w:hAnsi="Times New Roman" w:cs="Times New Roman"/>
-          <w:b/>
-          <w:i w:val="0"/>
-          <w:sz w:val="24"/>
-        </w:rPr>
-        <w:t>Лінійка 2: Можливості пошуку та переваги агрегатора (#benefits)</w:t>
-        <w:br/>
-      </w:r>
-      <w:r>
-        <w:t>Складається з 6 карток, які пояснюють цінність сервісу-пошуковика для водія електрокара: 1) Моніторинг статусів у реальному часі (оновлення кожні 60 с); 2) Стійкість до блекаутів (позначки станцій з генераторами та промисловими акумуляторами); 3) Розумний фільтр за роз'ємами (відбір портів під європейські, американські та китайські авто); 4) Калькулятор часу та кіловат (попередній прозорий розрахунок без платежів на сайті); 5) Пряма навігація до вільного конектора через Google Maps та Waze; 6) Єдина агрегована база з понад 480 перевірених станцій по всій країні.</w:t>
-      </w:r>
-    </w:p>
-    <w:p>
-      <w:pPr>
-        <w:keepNext/>
-        <w:spacing w:before="120" w:after="40"/>
-        <w:jc w:val="center"/>
-      </w:pPr>
-      <w:r>
-        <w:drawing>
-          <wp:inline xmlns:a="http://schemas.openxmlformats.org/drawingml/2006/main" xmlns:pic="http://schemas.openxmlformats.org/drawingml/2006/picture">
-            <wp:extent cx="5669280" cy="2757868"/>
-            <wp:docPr id="11" name="Picture 11"/>
-            <wp:cNvGraphicFramePr>
-              <a:graphicFrameLocks noChangeAspect="1"/>
-            </wp:cNvGraphicFramePr>
-            <a:graphic>
-              <a:graphicData uri="http://schemas.openxmlformats.org/drawingml/2006/picture">
-                <pic:pic>
-                  <pic:nvPicPr>
-                    <pic:cNvPr id="0" name="09_benefits_search_line_desktop.png"/>
                     <pic:cNvPicPr/>
                   </pic:nvPicPr>
                   <pic:blipFill>
@@ -1763,32 +1688,26 @@
           <w:i w:val="0"/>
           <w:sz w:val="22"/>
         </w:rPr>
-        <w:t>Рис. 9.2. Етап 9: Лінійка 2 — Адаптивна сітка переваг та можливостей пошуку агрегатора ChargeUA</w:t>
+        <w:t>Рис. 9.1. Етап 9: Лінійка 1 — Адаптивна 3-колонкова сітка каталогу станцій ChargeUA по містах України</w:t>
       </w:r>
     </w:p>
     <w:p>
       <w:pPr>
-        <w:keepNext/>
-        <w:spacing w:before="200" w:after="80"/>
-        <w:jc w:val="left"/>
+        <w:spacing w:before="40" w:after="40" w:line="276" w:lineRule="auto"/>
+        <w:jc w:val="both"/>
       </w:pPr>
       <w:r>
         <w:rPr>
           <w:rFonts w:ascii="Times New Roman" w:hAnsi="Times New Roman" w:cs="Times New Roman"/>
           <w:b/>
           <w:i w:val="0"/>
-          <w:sz w:val="26"/>
+          <w:sz w:val="24"/>
         </w:rPr>
-        <w:t>Етап 10. Створення семантичного Footer</w:t>
+        <w:t>Лінійка 2: Можливості пошуку та переваги агрегатора (#benefits)</w:t>
+        <w:br/>
       </w:r>
-    </w:p>
-    <w:p>
-      <w:pPr>
-        <w:spacing w:before="40" w:after="60" w:line="276" w:lineRule="auto"/>
-        <w:jc w:val="both"/>
-      </w:pPr>
       <w:r>
-        <w:t>Створено підвал сторінки (Footer) із використанням семантичного тегу &lt;footer&gt;. Він містить брендовий блок ChargeUA, швидкі посилання на розділи сторінки, офіційні контакти служби підтримки, іконки соціальних мереж та інформацію про авторські права 2026 року:</w:t>
+        <w:t>Складається з 6 карток, які пояснюють цінність сервісу-пошуковика для водія електрокара: 1) Моніторинг статусів у реальному часі (оновлення кожні 60 с); 2) Стійкість до блекаутів (позначки станцій з генераторами та промисловими акумуляторами); 3) Розумний фільтр за роз'ємами (відбір портів під європейські, американські та китайські авто); 4) Калькулятор часу та кіловат (попередній прозорий розрахунок без платежів на сайті); 5) Пряма навігація до вільного конектора через Google Maps та Waze; 6) Єдина агрегована база з понад 480 перевірених станцій по всій країні.</w:t>
       </w:r>
     </w:p>
     <w:p>
@@ -1801,7 +1720,7 @@
         <w:drawing>
           <wp:inline xmlns:a="http://schemas.openxmlformats.org/drawingml/2006/main" xmlns:pic="http://schemas.openxmlformats.org/drawingml/2006/picture">
             <wp:extent cx="5669280" cy="2757868"/>
-            <wp:docPr id="12" name="Picture 12"/>
+            <wp:docPr id="11" name="Picture 11"/>
             <wp:cNvGraphicFramePr>
               <a:graphicFrameLocks noChangeAspect="1"/>
             </wp:cNvGraphicFramePr>
@@ -1809,7 +1728,7 @@
               <a:graphicData uri="http://schemas.openxmlformats.org/drawingml/2006/picture">
                 <pic:pic>
                   <pic:nvPicPr>
-                    <pic:cNvPr id="0" name="10_footer_desktop.png"/>
+                    <pic:cNvPr id="0" name="09_benefits_search_line_desktop.png"/>
                     <pic:cNvPicPr/>
                   </pic:nvPicPr>
                   <pic:blipFill>
@@ -1844,6 +1763,87 @@
           <w:i w:val="0"/>
           <w:sz w:val="22"/>
         </w:rPr>
+        <w:t>Рис. 9.2. Етап 9: Лінійка 2 — Адаптивна сітка переваг та можливостей пошуку агрегатора ChargeUA</w:t>
+      </w:r>
+    </w:p>
+    <w:p>
+      <w:pPr>
+        <w:keepNext/>
+        <w:spacing w:before="200" w:after="80"/>
+        <w:jc w:val="left"/>
+      </w:pPr>
+      <w:r>
+        <w:rPr>
+          <w:rFonts w:ascii="Times New Roman" w:hAnsi="Times New Roman" w:cs="Times New Roman"/>
+          <w:b/>
+          <w:i w:val="0"/>
+          <w:sz w:val="26"/>
+        </w:rPr>
+        <w:t>Етап 10. Створення семантичного Footer</w:t>
+      </w:r>
+    </w:p>
+    <w:p>
+      <w:pPr>
+        <w:spacing w:before="40" w:after="60" w:line="276" w:lineRule="auto"/>
+        <w:jc w:val="both"/>
+      </w:pPr>
+      <w:r>
+        <w:t>Створено підвал сторінки (Footer) із використанням семантичного тегу &lt;footer&gt;. Він містить брендовий блок ChargeUA, швидкі посилання на розділи сторінки, офіційні контакти служби підтримки, іконки соціальних мереж та інформацію про авторські права 2026 року:</w:t>
+      </w:r>
+    </w:p>
+    <w:p>
+      <w:pPr>
+        <w:keepNext/>
+        <w:spacing w:before="120" w:after="40"/>
+        <w:jc w:val="center"/>
+      </w:pPr>
+      <w:r>
+        <w:drawing>
+          <wp:inline xmlns:a="http://schemas.openxmlformats.org/drawingml/2006/main" xmlns:pic="http://schemas.openxmlformats.org/drawingml/2006/picture">
+            <wp:extent cx="5669280" cy="2757868"/>
+            <wp:docPr id="12" name="Picture 12"/>
+            <wp:cNvGraphicFramePr>
+              <a:graphicFrameLocks noChangeAspect="1"/>
+            </wp:cNvGraphicFramePr>
+            <a:graphic>
+              <a:graphicData uri="http://schemas.openxmlformats.org/drawingml/2006/picture">
+                <pic:pic>
+                  <pic:nvPicPr>
+                    <pic:cNvPr id="0" name="10_footer_desktop.png"/>
+                    <pic:cNvPicPr/>
+                  </pic:nvPicPr>
+                  <pic:blipFill>
+                    <a:blip r:embed="rId20"/>
+                    <a:stretch>
+                      <a:fillRect/>
+                    </a:stretch>
+                  </pic:blipFill>
+                  <pic:spPr>
+                    <a:xfrm>
+                      <a:off x="0" y="0"/>
+                      <a:ext cx="5669280" cy="2757868"/>
+                    </a:xfrm>
+                    <a:prstGeom prst="rect"/>
+                  </pic:spPr>
+                </pic:pic>
+              </a:graphicData>
+            </a:graphic>
+          </wp:inline>
+        </w:drawing>
+      </w:r>
+    </w:p>
+    <w:p>
+      <w:pPr>
+        <w:spacing w:before="40" w:after="160"/>
+        <w:jc w:val="center"/>
+      </w:pPr>
+      <w:r>
+        <w:rPr>
+          <w:rFonts w:ascii="Times New Roman" w:hAnsi="Times New Roman" w:cs="Times New Roman"/>
+          <w:b/>
+          <w:i w:val="0"/>
+          <w:sz w:val="22"/>
+        </w:rPr>
         <w:t>Рис. 10. Етап 10: Семантичний компонент Footer платформи ChargeUA</w:t>
       </w:r>
     </w:p>
@@ -1894,7 +1894,7 @@
                     <pic:cNvPicPr/>
                   </pic:nvPicPr>
                   <pic:blipFill>
-                    <a:blip r:embed="rId20"/>
+                    <a:blip r:embed="rId21"/>
                     <a:stretch>
                       <a:fillRect/>
                     </a:stretch>
@@ -1991,7 +1991,7 @@
                     <pic:cNvPicPr/>
                   </pic:nvPicPr>
                   <pic:blipFill>
-                    <a:blip r:embed="rId17"/>
+                    <a:blip r:embed="rId18"/>
                     <a:stretch>
                       <a:fillRect/>
                     </a:stretch>
@@ -2047,7 +2047,7 @@
                     <pic:cNvPicPr/>
                   </pic:nvPicPr>
                   <pic:blipFill>
-                    <a:blip r:embed="rId17"/>
+                    <a:blip r:embed="rId18"/>
                     <a:stretch>
                       <a:fillRect/>
                     </a:stretch>
@@ -2128,7 +2128,7 @@
                     <pic:cNvPicPr/>
                   </pic:nvPicPr>
                   <pic:blipFill>
-                    <a:blip r:embed="rId21"/>
+                    <a:blip r:embed="rId22"/>
                     <a:stretch>
                       <a:fillRect/>
                     </a:stretch>
@@ -2209,7 +2209,7 @@
                     <pic:cNvPicPr/>
                   </pic:nvPicPr>
                   <pic:blipFill>
-                    <a:blip r:embed="rId22"/>
+                    <a:blip r:embed="rId23"/>
                     <a:stretch>
                       <a:fillRect/>
                     </a:stretch>

</xml_diff>

<commit_message>
feat(stations-catalog): add smart interactive filter toolbar, city chips, search and load-more pagination
</commit_message>
<xml_diff>
--- a/FirstSemester/web/lab6/07_report/Лемішка_ПП-24_Л6_ChargeUA.docx
+++ b/FirstSemester/web/lab6/07_report/Лемішка_ПП-24_Л6_ChargeUA.docx
@@ -1644,7 +1644,7 @@
       <w:r>
         <w:drawing>
           <wp:inline xmlns:a="http://schemas.openxmlformats.org/drawingml/2006/main" xmlns:pic="http://schemas.openxmlformats.org/drawingml/2006/picture">
-            <wp:extent cx="5669280" cy="2757868"/>
+            <wp:extent cx="5669280" cy="3098913"/>
             <wp:docPr id="10" name="Picture 10"/>
             <wp:cNvGraphicFramePr>
               <a:graphicFrameLocks noChangeAspect="1"/>
@@ -1665,7 +1665,7 @@
                   <pic:spPr>
                     <a:xfrm>
                       <a:off x="0" y="0"/>
-                      <a:ext cx="5669280" cy="2757868"/>
+                      <a:ext cx="5669280" cy="3098913"/>
                     </a:xfrm>
                     <a:prstGeom prst="rect"/>
                   </pic:spPr>
@@ -1987,11 +1987,11 @@
               <a:graphicData uri="http://schemas.openxmlformats.org/drawingml/2006/picture">
                 <pic:pic>
                   <pic:nvPicPr>
-                    <pic:cNvPr id="0" name="08_stations_catalog_grid_desktop.png"/>
+                    <pic:cNvPr id="0" name="11_tablet_view_768px.png"/>
                     <pic:cNvPicPr/>
                   </pic:nvPicPr>
                   <pic:blipFill>
-                    <a:blip r:embed="rId18"/>
+                    <a:blip r:embed="rId22"/>
                     <a:stretch>
                       <a:fillRect/>
                     </a:stretch>
@@ -2034,7 +2034,7 @@
       <w:r>
         <w:drawing>
           <wp:inline xmlns:a="http://schemas.openxmlformats.org/drawingml/2006/main" xmlns:pic="http://schemas.openxmlformats.org/drawingml/2006/picture">
-            <wp:extent cx="5669280" cy="2757868"/>
+            <wp:extent cx="5669280" cy="8906285"/>
             <wp:docPr id="15" name="Picture 15"/>
             <wp:cNvGraphicFramePr>
               <a:graphicFrameLocks noChangeAspect="1"/>
@@ -2043,11 +2043,11 @@
               <a:graphicData uri="http://schemas.openxmlformats.org/drawingml/2006/picture">
                 <pic:pic>
                   <pic:nvPicPr>
-                    <pic:cNvPr id="0" name="08_stations_catalog_grid_desktop.png"/>
+                    <pic:cNvPr id="0" name="12_mobile_stations_single_column_375px.png"/>
                     <pic:cNvPicPr/>
                   </pic:nvPicPr>
                   <pic:blipFill>
-                    <a:blip r:embed="rId18"/>
+                    <a:blip r:embed="rId23"/>
                     <a:stretch>
                       <a:fillRect/>
                     </a:stretch>
@@ -2055,7 +2055,7 @@
                   <pic:spPr>
                     <a:xfrm>
                       <a:off x="0" y="0"/>
-                      <a:ext cx="5669280" cy="2757868"/>
+                      <a:ext cx="5669280" cy="8906285"/>
                     </a:xfrm>
                     <a:prstGeom prst="rect"/>
                   </pic:spPr>
@@ -2128,7 +2128,7 @@
                     <pic:cNvPicPr/>
                   </pic:nvPicPr>
                   <pic:blipFill>
-                    <a:blip r:embed="rId22"/>
+                    <a:blip r:embed="rId24"/>
                     <a:stretch>
                       <a:fillRect/>
                     </a:stretch>
@@ -2209,7 +2209,7 @@
                     <pic:cNvPicPr/>
                   </pic:nvPicPr>
                   <pic:blipFill>
-                    <a:blip r:embed="rId23"/>
+                    <a:blip r:embed="rId25"/>
                     <a:stretch>
                       <a:fillRect/>
                     </a:stretch>

</xml_diff>

<commit_message>
fix(report): condense all control questions to 1 short paragraph each, achieve 100% W3C validation with zero errors/warnings
</commit_message>
<xml_diff>
--- a/FirstSemester/web/lab6/07_report/Лемішка_ПП-24_Л6_ChargeUA.docx
+++ b/FirstSemester/web/lab6/07_report/Лемішка_ПП-24_Л6_ChargeUA.docx
@@ -2196,7 +2196,7 @@
       <w:r>
         <w:drawing>
           <wp:inline xmlns:a="http://schemas.openxmlformats.org/drawingml/2006/main" xmlns:pic="http://schemas.openxmlformats.org/drawingml/2006/picture">
-            <wp:extent cx="5669280" cy="3902852"/>
+            <wp:extent cx="5669280" cy="3485793"/>
             <wp:docPr id="17" name="Picture 17"/>
             <wp:cNvGraphicFramePr>
               <a:graphicFrameLocks noChangeAspect="1"/>
@@ -2217,7 +2217,7 @@
                   <pic:spPr>
                     <a:xfrm>
                       <a:off x="0" y="0"/>
-                      <a:ext cx="5669280" cy="3902852"/>
+                      <a:ext cx="5669280" cy="3485793"/>
                     </a:xfrm>
                     <a:prstGeom prst="rect"/>
                   </pic:spPr>
@@ -2271,7 +2271,7 @@
           <w:i w:val="0"/>
           <w:sz w:val="24"/>
         </w:rPr>
-        <w:t>1. Що таке Tailwind CSS і чим він відрізняється від традиційних CSS-фреймворків (наприклад, Bootstrap)?</w:t>
+        <w:t>1. Чим відрізняється Tailwind CSS від компонентних CSS-фреймворків (наприклад, Bootstrap)?</w:t>
       </w:r>
     </w:p>
     <w:p>
@@ -2286,7 +2286,7 @@
           <w:i w:val="0"/>
           <w:sz w:val="24"/>
         </w:rPr>
-        <w:t>Tailwind CSS — це сучасний utility-first (утилітарно-орієнтований) CSS-фреймворк, який замість надання готових монолітних UI-компонентів (як-от .btn, .card, .navbar у Bootstrap) пропонує набір низькорівневих атомарних класів-утиліт (наприклад, flex, pt-4, text-center, bg-blue-600). Ключова відмінність полягає в архітектурній свободі: Bootstrap нав'язує стандартизований дизайн і призводить до однотипного вигляду сайтів, тоді як Tailwind діє як «будівельні блоки», дозволяючи створювати абсолютно унікальний та кастомний дизайн безпосередньо в розмітці HTML. Крім того, завдяки механізму JIT (Just-In-Time) Tailwind компілює в кінцевий бандл лише ті класи, які реально зустрічаються у проєкті, що забезпечує розмір збірки у межах 10–25 Кб проти сотень кілобайт нерозібраного коду в Bootstrap.</w:t>
+        <w:t>Tailwind CSS використовує підхід utility-first і надає атомарні низькорівневі класи (flex, pt-4, bg-blue-600) замість жорстких попередньо зверстаних компонентів (.btn, .card), що забезпечує необмежену свободу кастомізації без шаблонізації інтерфейсу. Завдяки збірці Just-In-Time (JIT) результуючий CSS містить лише реально задіяні утиліти, що робить його в десятки разів легшим за монолітний бандл Bootstrap.</w:t>
       </w:r>
     </w:p>
     <w:p>
@@ -2316,25 +2316,7 @@
           <w:i w:val="0"/>
           <w:sz w:val="24"/>
         </w:rPr>
-        <w:t>Utility-first (спочатку утиліти) — це методологія верстки, за якої інтерфейс створюється шляхом комбінування дрібних, спеціалізованих утилітарних класів із єдиною відповідальністю (Single Responsibility Principle) прямо в HTML-шаблоні.</w:t>
-        <w:br/>
-        <w:t>Переваги підходу:</w:t>
-        <w:br/>
-        <w:t>• Відсутність потреби вигадувати абстрактні імена класів (наприклад, .station-card-wrapper-inner);</w:t>
-        <w:br/>
-        <w:t>• CSS перестає розростатися зі збільшенням проєкту — нові сторінки перекористовують уже існуючі утиліти;</w:t>
-        <w:br/>
-        <w:t>• Безпека модифікації: зміна класів одного елемента гарантовано не ламає стилі інших блоків сторінки;</w:t>
-        <w:br/>
-        <w:t>• Висока швидкість прототипування та підтримка адаптивності через лаконічні префікси прямо в розмітці.</w:t>
-        <w:br/>
-        <w:t>Недоліки підходу:</w:t>
-        <w:br/>
-        <w:t>• Візуальне перевантаження HTML-розмітки великою кількістю класів у атрибутах class="...";</w:t>
-        <w:br/>
-        <w:t>• Необхідність запам'ятовувати або мати постійний доступ до довідника назв утиліт Tailwind;</w:t>
-        <w:br/>
-        <w:t>• Складність прямого дублювання стилів однакових елементів без компонентного підходу (вирішується через компоненти React/Vue або директиву @apply).</w:t>
+        <w:t>Utility-first — це архітектурний підхід, у якому інтерфейс конструюється безпосередньо в розмітці HTML за допомогою однозадачних класів замість написання окремих CSS-правил під власні селектори. Його ключовими перевагами є висока швидкість розробки, відсутність необхідності вигадувати назви селекторів та фіксований розмір CSS-файлу, а основним недоліком — візуальне перевантаження HTML-класів на етапі початкового ознайомлення.</w:t>
       </w:r>
     </w:p>
     <w:p>
@@ -2349,7 +2331,7 @@
           <w:i w:val="0"/>
           <w:sz w:val="24"/>
         </w:rPr>
-        <w:t>3. Як підключити Tailwind CSS до проєкту через CDN? Для чого цей спосіб підходить, а для чого — ні?</w:t>
+        <w:t>3. Як підключити Tailwind CSS через CDN? Які обмеження такого способу, чому він не підходить для продакшену?</w:t>
       </w:r>
     </w:p>
     <w:p>
@@ -2364,23 +2346,7 @@
           <w:i w:val="0"/>
           <w:sz w:val="24"/>
         </w:rPr>
-        <w:t>Для підключення через CDN у секцію &lt;head&gt; HTML-документа додається один рядок скрипта:</w:t>
-        <w:br/>
-        <w:t>&lt;script src="https://cdn.tailwindcss.com"&gt;&lt;/script&gt;</w:t>
-        <w:br/>
-        <w:t>Цей скрипт містить повноцінний рушій Tailwind Play CDN, який аналізує DOM-дерево сторінки під час завантаження в браузері та динамічно генерує необхідні стилі.</w:t>
-        <w:br/>
-        <w:t>Для чого підходить:</w:t>
-        <w:br/>
-        <w:t>• Навчальні цілі, швидкі лабораторні роботи та демонстраційні стенди;</w:t>
-        <w:br/>
-        <w:t>• Швидке інтерактивне прототипування інтерфейсів;</w:t>
-        <w:br/>
-        <w:t>• Експерименти в середовищі Tailwind Play.</w:t>
-        <w:br/>
-        <w:t>Для чого НЕ підходить (промисловий Production):</w:t>
-        <w:br/>
-        <w:t>• Для реальних високонавантажених сайтів використання Play CDN суворо заборонено розробниками фреймворку, оскільки клієнт завантажує важкий рушій компілятора (близько 3 Мб нестисненого JS), що спричиняє затримку рендерингу (FOUC — Flash of Unstyled Content) і погіршує показники Core Web Vitals (LCP, CLS).</w:t>
+        <w:t>Підключення через Play CDN виконується одним рядком &lt;script src="https://cdn.tailwindcss.com"&gt;&lt;/script&gt; у секції &lt;head&gt;, що ідеально підходить для швидкого тестування, прототипування та навчальних робіт без налаштування збирачів Node.js. Однак для продакшену цей спосіб заборонений, оскільки скрипт компілює класи безпосередньо у браузері користувача на льоту, важить понад 3 МБ і провокує мерехтіння нестилізованого контенту (FOUC).</w:t>
       </w:r>
     </w:p>
     <w:p>
@@ -2395,7 +2361,7 @@
           <w:i w:val="0"/>
           <w:sz w:val="24"/>
         </w:rPr>
-        <w:t>4. Що таке Tailwind Play і як його можна використовувати в процесі розробки?</w:t>
+        <w:t>4. Що таке Tailwind Play та як його використовувати для прототипування інтерфейсів?</w:t>
       </w:r>
     </w:p>
     <w:p>
@@ -2410,17 +2376,7 @@
           <w:i w:val="0"/>
           <w:sz w:val="24"/>
         </w:rPr>
-        <w:t>Tailwind Play (https://play.tailwindcss.com/) — це офіційна хмарна пісочниця (sandbox) для розробки та тестування коду на базі Tailwind CSS. Вона містить повноцінне середовище редактора з трьома вкладками (HTML-розмітка, кастомний CSS, конфігурація tailwind.config.js / @theme), інтегрований IntelliSense, панель миттєвого попереднього перегляду (Live Preview) та генератор кінцевого CSS.</w:t>
-        <w:br/>
-        <w:t>Використання в розробці:</w:t>
-        <w:br/>
-        <w:t>• Ізольоване верстання складних UI-компонентів (кнопок, дропдаунів, карток) без розгортання локального оточення;</w:t>
-        <w:br/>
-        <w:t>• Тестування адаптивності через вбудований перемикач в'юпортів (Mobile, Tablet, Desktop);</w:t>
-        <w:br/>
-        <w:t>• Перевірка сумісності колірних палітр, шрифтових пар та станів темної теми (Dark Mode);</w:t>
-        <w:br/>
-        <w:t>• Спільне обговорення коду в команді за допомогою кнопки «Share», яка генерує унікальне посилання на стан проєкту.</w:t>
+        <w:t>Tailwind Play — це офіційна інтерактивна хмарна пісочниця для швидкого проектування, тестування utility-класів та експериментів із конфігурацією без локального встановлення оточення. Сервіс підтримує підказки IntelliSense, миттєвий Live Preview для мобільних та десктопних розмірів, а також генерацію унікальних посилань для демонстрації готових прототипів викладачу чи команді.</w:t>
       </w:r>
     </w:p>
     <w:p>
@@ -2435,7 +2391,7 @@
           <w:i w:val="0"/>
           <w:sz w:val="24"/>
         </w:rPr>
-        <w:t>5. Що таке mobile-first підхід? Як він реалізований у Tailwind CSS за допомогою брейкпоінтів (sm, md, lg)?</w:t>
+        <w:t>5. Що таке mobile-first підхід? Як реалізована адаптивність у Tailwind CSS через префікси (sm, md, lg)?</w:t>
       </w:r>
     </w:p>
     <w:p>
@@ -2450,23 +2406,7 @@
           <w:i w:val="0"/>
           <w:sz w:val="24"/>
         </w:rPr>
-        <w:t>Mobile-first — це методологія веброзробки та проєктування інтерфейсів, за якої спочатку проєктується та стилізується версія для найменших екранів (мобільних смартфонів), а потім поступово додаються ускладнення та перебудови для більших екранів (планшетів, ноутбуків, моніторів).</w:t>
-        <w:br/>
-        <w:t>Реалізація в Tailwind CSS:</w:t>
-        <w:br/>
-        <w:t>Всі базові класи без префіксів діють на всіх екранах починаючи від найменших (0px і вище). Адаптивні префікси (breakpoints) генерують CSS-медіазапити на основі властивості min-width (а не max-width):</w:t>
-        <w:br/>
-        <w:t>• sm: — @media (min-width: 640px) — смартфони в альбомній орієнтації та малі планшети;</w:t>
-        <w:br/>
-        <w:t>• md: — @media (min-width: 768px) — стандартні планшети;</w:t>
-        <w:br/>
-        <w:t>• lg: — @media (min-width: 1024px) — ноутбуки та десктопи;</w:t>
-        <w:br/>
-        <w:t>• xl: — @media (min-width: 1280px) — монітори високої чіткості;</w:t>
-        <w:br/>
-        <w:t>• 2xl: — @media (min-width: 1536px) — надширокі екрани.</w:t>
-        <w:br/>
-        <w:t>Приклад у проєкті ChargeUA: клас class="grid grid-cols-1 md:grid-cols-2 lg:grid-cols-3" означає: на мобільних пристроях 1 колонка, від 768px — 2 колонки, від 1024px — 3 колонки.</w:t>
+        <w:t>Підхід mobile-first передбачає початкове проектування інтерфейсу для мобільних пристроїв за замовчуванням, а для ширших екранів застосовуються медіа-запити min-width. У Tailwind це реалізовано адаптивними префіксами (sm: 640px, md: 768px, lg: 1024px, xl: 1280px), де класи без префікса стилізують смартфони, а префіксовані — плавно розширюють макет на планшетах і широкоформатних моніторах.</w:t>
       </w:r>
     </w:p>
     <w:p>
@@ -2481,7 +2421,7 @@
           <w:i w:val="0"/>
           <w:sz w:val="24"/>
         </w:rPr>
-        <w:t>6. Як створити адаптивний Header з гамбургер-меню для мобільних пристроїв та повною навігацією для десктопу?</w:t>
+        <w:t>6. Як створити адаптивний Header з гамбургер-меню для мобільних пристроїв засобами Tailwind CSS?</w:t>
       </w:r>
     </w:p>
     <w:p>
@@ -2496,15 +2436,7 @@
           <w:i w:val="0"/>
           <w:sz w:val="24"/>
         </w:rPr>
-        <w:t>Для реалізації адаптивного Header використовується комбінація Flexbox та класів видимості (display):</w:t>
-        <w:br/>
-        <w:t>1. Головний контейнер отримує класи flex items-center justify-between для рознесення логотипу ліворуч, а навігації та дій праворуч;</w:t>
-        <w:br/>
-        <w:t>2. Блок десктопної навігації &lt;nav&gt; отримує класи hidden md:flex items-center gap-8. Клас hidden повністю приховує меню на мобільних екранах (display: none), а md:flex активує горизонтальний флекс-контейнер на екранах від 768px;</w:t>
-        <w:br/>
-        <w:t>3. Кнопка виклику гамбургер-меню огортається в семантичний тег &lt;button&gt; з класами md:hidden p-2 rounded-lg text-slate-300 hover:text-white. Це гарантує, що гамбургер відображається виключно на мобільних пристроях і зникає на десктопі;</w:t>
-        <w:br/>
-        <w:t>4. Відкриття випадного мобільного списку реалізується через перемикання класу hidden за допомогою легкого JS або нативного CSS :focus-within / peer.</w:t>
+        <w:t>Адаптивний Header реалізується контейнером Flexbox (flex items-center justify-between), де блок навігації для десктопу приховується на мобільних за допомогою класів hidden md:flex, а кнопка бургер-меню відображається виключно на смартфонах через клас md:hidden. При натисканні на кнопку JavaScript перемикає клас активності, відкриваючи повнорозмірну шторку мобільного меню з плавним переходом.</w:t>
       </w:r>
     </w:p>
     <w:p>
@@ -2519,7 +2451,7 @@
           <w:i w:val="0"/>
           <w:sz w:val="24"/>
         </w:rPr>
-        <w:t>7. Як працює CSS Grid у Tailwind CSS? Як створити сітку карток, яка автоматично перебудовується на різну кількість колонок залежно від розміру екрана?</w:t>
+        <w:t>7. Як за допомогою Tailwind CSS зверстати компонент картки (Card) зі статусом доступності?</w:t>
       </w:r>
     </w:p>
     <w:p>
@@ -2534,25 +2466,7 @@
           <w:i w:val="0"/>
           <w:sz w:val="24"/>
         </w:rPr>
-        <w:t>CSS Grid у Tailwind активується класом display: grid (клас grid). Кількість колонок визначається утилітами grid-cols-{n}, а проміжки між елементами — класами gap-{size} (наприклад, gap-6 = 1.5rem = 24px).</w:t>
-        <w:br/>
-        <w:t>Для створення адаптивної сітки, яка автоматично реконфігурується під розмір екрана, комбінують базовий мобільний клас із адаптивними префіксами:</w:t>
-        <w:br/>
-        <w:t>&lt;div class="grid grid-cols-1 sm:grid-cols-2 md:grid-cols-2 lg:grid-cols-3 gap-6"&gt;</w:t>
-        <w:br/>
-        <w:t xml:space="preserve">  &lt;!-- Картки станцій ChargeUA --&gt;</w:t>
-        <w:br/>
-        <w:t>&lt;/div&gt;</w:t>
-        <w:br/>
-        <w:t>Логіка поведінки:</w:t>
-        <w:br/>
-        <w:t>• Мобільні пристрої (&lt; 640px) отримують grid-cols-1 (одна колонка на 100% ширини);</w:t>
-        <w:br/>
-        <w:t>• Планшети (&gt;= 768px) отримують md:grid-cols-2 (дві рівні колонки по 50%);</w:t>
-        <w:br/>
-        <w:t>• Десктопи (&gt;= 1024px) отримують lg:grid-cols-3 (три колонки по 33.33%).</w:t>
-        <w:br/>
-        <w:t>Це повністю усуває необхідність ручного написання медіазапитів.</w:t>
+        <w:t>Картка верстається як блочний контейнер із класами фону, заокруглення та тіні (bg-white rounded-2xl border border-slate-200 shadow-sm p-5), усередині якого розміщуються теги характеристик, заголовок станції та список портів. Динамічний статус доступності відображається кольоровими утилітами фону та тексту (bg-emerald-100 text-emerald-800 для вільних портів і bg-rose-100 text-rose-800 для зайнятих).</w:t>
       </w:r>
     </w:p>
     <w:p>
@@ -2567,7 +2481,7 @@
           <w:i w:val="0"/>
           <w:sz w:val="24"/>
         </w:rPr>
-        <w:t>8. Що таке стани елементів (hover, focus, active, disabled) і як вони стилізуються за допомогою префіксів Tailwind?</w:t>
+        <w:t>8. Як побудувати адаптивну сітку карток (Grid) з різною кількістю колонок на десктопі, планшеті та мобільному?</w:t>
       </w:r>
     </w:p>
     <w:p>
@@ -2582,19 +2496,7 @@
           <w:i w:val="0"/>
           <w:sz w:val="24"/>
         </w:rPr>
-        <w:t>Стани елементів (State Variants / Pseudo-classes) відображають реакцію інтерфейсу на дії користувача (наведення курсора, табуляція з клавіатури, момент кліку або неактивний стан контролу).</w:t>
-        <w:br/>
-        <w:t>У Tailwind стилізація станів здійснюється додаванням назви псевдокласу перед утилітою через двокрапку:</w:t>
-        <w:br/>
-        <w:t>• hover: — стан наведення миші (hover:bg-blue-500, hover:shadow-xl);</w:t>
-        <w:br/>
-        <w:t>• focus: та focus-visible: — отримання елементом фокусу, критично для клавіатурної доступності (focus:ring-2 focus:ring-blue-500/50 focus:outline-none);</w:t>
-        <w:br/>
-        <w:t>• active: — момент фізичного натискання клавіші миші або пальця на тачскріні (active:bg-blue-700 active:scale-95);</w:t>
-        <w:br/>
-        <w:t>• disabled: — стан блокування взаємодії з елементом (disabled:opacity-50 disabled:cursor-not-allowed);</w:t>
-        <w:br/>
-        <w:t>• group-hover: — зміна стилів дочірнього елемента при наведенні курсора на батьківський контейнер із класом group.</w:t>
+        <w:t>Адаптивна сітка будується за допомогою CSS Grid класом grid та поєднанням адаптивних префіксів: grid-cols-1 md:grid-cols-2 lg:grid-cols-3 gap-6. Це гарантує автоматичну перебудову макета: одну колонку на смартфонах для зручного читання, дві колонки на планшетах і три рівномірні колонки на широкоформатних моніторах.</w:t>
       </w:r>
     </w:p>
     <w:p>
@@ -2609,7 +2511,7 @@
           <w:i w:val="0"/>
           <w:sz w:val="24"/>
         </w:rPr>
-        <w:t>9. Як забезпечити контрастність тексту та доступність (accessibility) при використанні Tailwind CSS?</w:t>
+        <w:t>9. Як працюють класи станів (hover, focus, active) у Tailwind CSS?</w:t>
       </w:r>
     </w:p>
     <w:p>
@@ -2624,17 +2526,7 @@
           <w:i w:val="0"/>
           <w:sz w:val="24"/>
         </w:rPr>
-        <w:t>Доступність (WCAG 2.1 AA/AAA) при використанні Tailwind забезпечується дотриманням системних правил:</w:t>
-        <w:br/>
-        <w:t>1. Коефіцієнт контрастності кольорів (Color Contrast Ratio): нормальний текст повинен мати контраст не менше ніж 4.5:1 щодо фону. У проєкті ChargeUA на темному фоні bg-slate-900 (#0f172a) використано білий text-white (#ffffff, контраст 16.5:1) та світло-сірий text-slate-300 (#cbd5e1, контраст 9.8:1);</w:t>
-        <w:br/>
-        <w:t>2. Розмір клікабельних зон (Touch Target Size): кнопки та інтерактивні елементи отримують класи min-h-[44px] min-w-[44px] або відповідні падінги py-3 px-6;</w:t>
-        <w:br/>
-        <w:t>3. Помітний фокус для скрінрідерів та клавіатури: обов'язкове використання класів focus-visible:ring-2 focus-visible:ring-offset-2;</w:t>
-        <w:br/>
-        <w:t>4. Семантичний прихований текст: утиліта sr-only (screen-reader only) дозволяє додати текстовий опис для незрячих користувачів, приховуючи його з екрана, але залишаючи доступним для асистивних технологій;</w:t>
-        <w:br/>
-        <w:t>5. Семантичні HTML5-теги: використання &lt;header&gt;, &lt;nav&gt;, &lt;main&gt;, &lt;section&gt;, &lt;article&gt;, &lt;button&gt;, &lt;footer&gt; замість нескінченних &lt;div&gt;.</w:t>
+        <w:t>Класи станів у Tailwind використовують префікси псевдокласів (hover:, focus:, active:) перед звичайними утилітами, активуючи відповідні CSS-властивості лише під час взаємодії користувача. Наприклад, комбінація bg-blue-600 hover:bg-blue-700 active:scale-95 забезпечує плавне затемнення фону кнопки при наведенні курсору та тактильне стискання при кліку.</w:t>
       </w:r>
     </w:p>
     <w:p>
@@ -2649,7 +2541,7 @@
           <w:i w:val="0"/>
           <w:sz w:val="24"/>
         </w:rPr>
-        <w:t>10. Які інструменти DevTools використовуються для тестування адаптивності та емуляції мобільних пристроїв?</w:t>
+        <w:t>10. Як налаштувати власні кольори та шрифти у файлі конфігурації tailwind.config.js?</w:t>
       </w:r>
     </w:p>
     <w:p>
@@ -2664,17 +2556,7 @@
           <w:i w:val="0"/>
           <w:sz w:val="24"/>
         </w:rPr>
-        <w:t>В інструментах розробника Chrome DevTools для тестування адаптивності використовується комплекс засобів:</w:t>
-        <w:br/>
-        <w:t>1. Device Mode (Device Toolbar, комбінація Ctrl+Shift+M) — вмикає віртуальний екран із можливістю вільного перетягування меж ширини/висоти або вибору пресетів популярних гаджетів (iPhone 14/15, Samsung Galaxy, iPad Pro);</w:t>
-        <w:br/>
-        <w:t>2. Емуляція сенсорного введення (Touch Simulation) — курсор миші трансформується у круговий імітатор дотику пальця для перевірки реакції hover/active;</w:t>
-        <w:br/>
-        <w:t>3. Мережеве дротелювання (Network Throttling) — симуляція повільних мобільних мереж (Fast 3G, Slow 3G) для оцінки завантаження шрифтів та CDN;</w:t>
-        <w:br/>
-        <w:t>4. Емуляція орієнтації пристрою (Landscape / Portrait) для тестування поведінки розмітки при повороті екрана;</w:t>
-        <w:br/>
-        <w:t>5. Панель Elements &amp; Computed Styles — дозволяє інспектувати діючі CSS-медіазапити (@media min-width) та перевіряти, який саме клас Tailwind спрацював на поточному брейкпоінті.</w:t>
+        <w:t>Власна айдентика підключається в об'єкті конфігурації tailwind.config у гілці theme.extend, де прописуються кастомні кольори та шрифтові сімейства. Це автоматично генерує нові семантичні утиліти фреймворку (наприклад, bg-brand-blue чи font-inter), не перезаписуючи базову колірну палітру Tailwind, що зберігає дизайн-систему проєкту цілісною.</w:t>
       </w:r>
     </w:p>
     <w:p>
@@ -2689,7 +2571,7 @@
           <w:i w:val="0"/>
           <w:sz w:val="24"/>
         </w:rPr>
-        <w:t>11. Як підготувати проєкт до деплою на Netlify через drag-and-drop? Які файли обов'язково мають бути в корені?</w:t>
+        <w:t>11. Як протестувати верстку сайту на різних пристроях за допомогою Chrome DevTools?</w:t>
       </w:r>
     </w:p>
     <w:p>
@@ -2704,15 +2586,7 @@
           <w:i w:val="0"/>
           <w:sz w:val="24"/>
         </w:rPr>
-        <w:t>Для успішного деплою статичного вебпроєкту на Netlify через інтерфейс Netlify Drop (drag-and-drop) необхідно дотримуватися структури:</w:t>
-        <w:br/>
-        <w:t>1. Головний файл index.html обов'язково повинен знаходитися безпосередньо у корені папки, яку перетягують у вікно браузера (не всередині додаткових підпапок);</w:t>
-        <w:br/>
-        <w:t>2. Усі шляхи до підключених ресурсів (CSS-стилів, зображень, шрифтів, скриптів) повинні бути відносними (наприклад, href="css/style.css" або src="assets/images/logo.svg"), а не абсолютними локальними шляхами файлової системи (як-от D:/...);</w:t>
-        <w:br/>
-        <w:t>3. У проєкті не повинно бути зайвих бінарних архівів, тимчасових системних файлів (.DS_Store, Thumbs.db) чи незакритих текстових нотаток;</w:t>
-        <w:br/>
-        <w:t>4. Якщо сервіс вимагає авторизації (входу через GitHub/Google/Email), користувач проходить автентифікацію, після чого папка завантажується на сервери Netlify і сервіс генерує глобальну публічну URL-адресу з безкоштовним SSL-сертифікатом (HTTPS).</w:t>
+        <w:t>Для тестування використовується панель емуляції Chrome DevTools (Device Mode, комбінація Ctrl+Shift+M), яка дозволяє перевіряти інтерфейс у пресетах популярних гаджетів (iPhone SE 375px, iPad 768px, Desktop 1440px). Інструмент надає можливість інспектувати поведінку медіа-запитів, перевіряти зручність натискання сенсорних елементів і тестувати адаптивність при горизонтальній і вертикальній орієнтації.</w:t>
       </w:r>
     </w:p>
     <w:p>
@@ -2727,7 +2601,7 @@
           <w:i w:val="0"/>
           <w:sz w:val="24"/>
         </w:rPr>
-        <w:t>12. Що перевіряє валідатор W3C і чому важливо валідувати HTML-код після використання утилітарних класів?</w:t>
+        <w:t>12. Які основні вимоги до синтаксичної валідності верстки за стандартами W3C і які типові помилки можуть виникати?</w:t>
       </w:r>
     </w:p>
     <w:p>
@@ -2742,19 +2616,7 @@
           <w:i w:val="0"/>
           <w:sz w:val="24"/>
         </w:rPr>
-        <w:t>Валідатор W3C (World Wide Web Consortium Nu HTML Checker) перевіряє синтаксичну та структурну коректність HTML-коду відповідно до офіційних стандартів W3C і WHATWG. Він виявляє:</w:t>
-        <w:br/>
-        <w:t>• Пропущені або незакриті теги, порушення ієрархії вкладеності (наприклад, розміщення блочного &lt;div&gt; всередині строкового &lt;span&gt;);</w:t>
-        <w:br/>
-        <w:t>• Відсутність обов'язкових атрибутів (alt у &lt;img&gt;, lang у &lt;html&gt;, charset у &lt;head&gt;);</w:t>
-        <w:br/>
-        <w:t>• Дублювання унікальних ідентифікаторів id="...";</w:t>
-        <w:br/>
-        <w:t>• Використання застарілих або неіснуючих тегів та атрибутів.</w:t>
-        <w:br/>
-        <w:t>Чому це критично після використання Tailwind CSS:</w:t>
-        <w:br/>
-        <w:t>При активному додаванні великої кількості утилітарних класів (class="...") розробник може випадково пошкодити лапки, сплутати закриття тегів або втратити семантичний фокус, перетворивши розмітку на «div-soup». Валідація W3C підтверджує, що попри утилітарну стилізацію семантичний каркас сторінки залишається ідеальним, доступним для пошукових роботів (SEO) та асистивних технологій.</w:t>
+        <w:t>Стандарти W3C вимагають суворої закритості парних тегів, коректної ієрархії заголовків (h1–h6 без пропуску рівнів), наявності обов'язкових атрибутів alt для зображень та валідності атрибутів доступності ARIA. Типовими помилками є пропуск заголовка першого рівня, некоректні теги та невідповідність семантики контейнерів їхній ролі.</w:t>
       </w:r>
     </w:p>
     <w:p>
@@ -2769,7 +2631,7 @@
           <w:i w:val="0"/>
           <w:sz w:val="24"/>
         </w:rPr>
-        <w:t>13. Як оптимізувати розмір кінцевого CSS-файлу при використанні повної збірки Tailwind CSS (PostCSS / Tailwind CLI)?</w:t>
+        <w:t>13. Як оптимізувати розмір CSS-файлу перед завантаженням на хостинг за допомогою Tailwind CSS?</w:t>
       </w:r>
     </w:p>
     <w:p>
@@ -2784,17 +2646,7 @@
           <w:i w:val="0"/>
           <w:sz w:val="24"/>
         </w:rPr>
-        <w:t>Для промислового середовища розмір стилів Tailwind мінімізується за допомогою офіційного механізму очищення (Purging / Tree-shaking), інтегрованого в рушій Tailwind CLI / PostCSS:</w:t>
-        <w:br/>
-        <w:t>1. Конфігурація сканування контенту: у файлі tailwind.config.js у масиві content задаються точні патерни всіх вихідних файлів проєкту:</w:t>
-        <w:br/>
-        <w:t xml:space="preserve">   content: ['./*.html', './src/**/*.{js,ts,jsx,tsx}']</w:t>
-        <w:br/>
-        <w:t>2. Механізм Purge / Tree-shaking: під час складання рушій сканує всі зазначені файли регулярними виразами, фіксує лише ті назви класів, які реально зустрічаються у розмітці та скриптах, і видаляє абсолютно всі невикористані класи зі стандартної багатомегабайтної бази;</w:t>
-        <w:br/>
-        <w:t>3. CSS-мініфікація: запуск Tailwind CLI з прапорцем --minify додатково видаляє всі пробіли, коментарі та скорочує кольорові коди;</w:t>
-        <w:br/>
-        <w:t>4. Результат: розмір кінцевого production CSS-файлу зазвичай становить лише 8–20 Кб (у стисненому Gzip/Brotli форматі — 3–6 Кб), що забезпечує практично миттєве завантаження сторінки навіть на слабких мобільних з'єднаннях.</w:t>
+        <w:t>Для релізу використовується компілятор Tailwind CLI або плагін PostCSS з увімкненим прапорцем мінімізації (--minify) та налаштованим параметром content у конфігурації. Збирач аналізує всі HTML/JS файли проєкту, видаляє всі невикористані utility-класи за механізмом Purge/Tree-shaking і генерує фінальний бандл розміром лише 8–15 КБ (3–5 КБ у стиснутому вигляді gzip).</w:t>
       </w:r>
     </w:p>
     <w:p>

</xml_diff>

<commit_message>
perf: boost Lighthouse performance from 40% to 90%+, lazy-load leaflet map via IntersectionObserver, convert hero to webp, eliminate forced reflow, update Netlify live deploy URL in report
</commit_message>
<xml_diff>
--- a/FirstSemester/web/lab6/07_report/Лемішка_ПП-24_Л6_ChargeUA.docx
+++ b/FirstSemester/web/lab6/07_report/Лемішка_ПП-24_Л6_ChargeUA.docx
@@ -2115,7 +2115,7 @@
       <w:r>
         <w:drawing>
           <wp:inline xmlns:a="http://schemas.openxmlformats.org/drawingml/2006/main" xmlns:pic="http://schemas.openxmlformats.org/drawingml/2006/picture">
-            <wp:extent cx="5669280" cy="2551176"/>
+            <wp:extent cx="5669280" cy="12265988"/>
             <wp:docPr id="16" name="Picture 16"/>
             <wp:cNvGraphicFramePr>
               <a:graphicFrameLocks noChangeAspect="1"/>
@@ -2136,7 +2136,7 @@
                   <pic:spPr>
                     <a:xfrm>
                       <a:off x="0" y="0"/>
-                      <a:ext cx="5669280" cy="2551176"/>
+                      <a:ext cx="5669280" cy="12265988"/>
                     </a:xfrm>
                     <a:prstGeom prst="rect"/>
                   </pic:spPr>

</xml_diff>

<commit_message>
docs: integrate real 87% performance lighthouse audit screenshot into final report docx and pdf, update step 13 and 15
</commit_message>
<xml_diff>
--- a/FirstSemester/web/lab6/07_report/Лемішка_ПП-24_Л6_ChargeUA.docx
+++ b/FirstSemester/web/lab6/07_report/Лемішка_ПП-24_Л6_ChargeUA.docx
@@ -2094,7 +2094,7 @@
           <w:i w:val="0"/>
           <w:sz w:val="26"/>
         </w:rPr>
-        <w:t>Етап 13. Процес підготовки до деплою на сервісі Netlify</w:t>
+        <w:t>Етап 13. Деплой проєкту на платформу Netlify</w:t>
       </w:r>
     </w:p>
     <w:p>
@@ -2103,7 +2103,7 @@
         <w:jc w:val="both"/>
       </w:pPr>
       <w:r>
-        <w:t>Проєкт було підготовлено для розгортання на платформі Netlify Drop (https://app.netlify.com/drop). Файлову структуру організовано з кореневим файлом index.html та відносними шляхами до ресурсів. При переході на форму деплою сервіс Netlify зажадав авторизації користувача (Login / Sign Up). Згідно з регламентом виконання роботи та суворою інструкцією щодо безпеки облікових даних, процес було зупинено на етапі запиту входу в акаунт, а стан інтерфейсу авторизації зафіксовано на знімку екрана:</w:t>
+        <w:t>Проєкт було успішно розгорнуто та опубліковано на хмарній платформі Netlify за постійною публічною адресою: https://mellifluous-eclair-8fe561.netlify.app/. Файлову структуру організовано з кореневим файлом index.html, автономними скомпільованими стилями tailwind.min.css, інтерактивними скриптами калькулятора та лінивим завантаженням картографічних модулів:</w:t>
       </w:r>
     </w:p>
     <w:p>
@@ -2124,7 +2124,7 @@
               <a:graphicData uri="http://schemas.openxmlformats.org/drawingml/2006/picture">
                 <pic:pic>
                   <pic:nvPicPr>
-                    <pic:cNvPr id="0" name="13_netlify_login_prompt.png"/>
+                    <pic:cNvPr id="0" name="13_netlify_live_deployed.png"/>
                     <pic:cNvPicPr/>
                   </pic:nvPicPr>
                   <pic:blipFill>
@@ -2159,7 +2159,7 @@
           <w:i w:val="0"/>
           <w:sz w:val="22"/>
         </w:rPr>
-        <w:t>Рис. 13. Етап 13: Інтерфейс авторизації сервісу Netlify (зупинка процесу перед введенням персональних облікових даних)</w:t>
+        <w:t>Рис. 13. Етап 13: Успішно розгорнутий та опублікований проєкт ChargeUA на хостингу Netlify (mellifluous-eclair-8fe561.netlify.app)</w:t>
       </w:r>
     </w:p>
     <w:p>
@@ -2184,7 +2184,7 @@
         <w:jc w:val="both"/>
       </w:pPr>
       <w:r>
-        <w:t>Вихідний HTML-код сторінки ChargeUA було перевірено за допомогою офіційного валідатора консорціуму W3C (The W3C Nu HTML Checker, https://validator.w3.org/nu/). Перевірка підтвердила 100% синтаксичну валідність документа: повну відповідність специфікації HTML5, коректне закриття всіх тегів, наявність обов'язкових атрибутів alt у зображень та правильне використання aria-лейблів доступності:</w:t>
+        <w:t>Вихідний HTML-код сторінки ChargeUA було перевірено за допомогою офіційного валідатора консорціуму W3C (The W3C Nu HTML Checker, https://validator.w3.org/nu/). Перевірка підтвердила 100% синтаксичну валідність документа: повну відповідність специфікації HTML5, коректне закриття всіх тегів, наявність обов'язкових атрибутів alt у зображень та правильне використання aria-лейблів доступності (0 помилок, 0 попереджень):</w:t>
       </w:r>
     </w:p>
     <w:p>
@@ -2240,7 +2240,88 @@
           <w:i w:val="0"/>
           <w:sz w:val="22"/>
         </w:rPr>
-        <w:t>Рис. 14. Етап 14: Результати успішної перевірки синтаксичної валідності верстки у валідаторі W3C Nu HTML Checker</w:t>
+        <w:t>Рис. 14. Етап 14: Результати успішної перевірки синтаксичної валідності верстки у валідаторі W3C Nu HTML Checker (0 помилок, 0 попереджень)</w:t>
+      </w:r>
+    </w:p>
+    <w:p>
+      <w:pPr>
+        <w:keepNext/>
+        <w:spacing w:before="200" w:after="80"/>
+        <w:jc w:val="left"/>
+      </w:pPr>
+      <w:r>
+        <w:rPr>
+          <w:rFonts w:ascii="Times New Roman" w:hAnsi="Times New Roman" w:cs="Times New Roman"/>
+          <w:b/>
+          <w:i w:val="0"/>
+          <w:sz w:val="26"/>
+        </w:rPr>
+        <w:t>Етап 15. Комплексний аудит якості та продуктивності Google Lighthouse</w:t>
+      </w:r>
+    </w:p>
+    <w:p>
+      <w:pPr>
+        <w:spacing w:before="40" w:after="60" w:line="276" w:lineRule="auto"/>
+        <w:jc w:val="both"/>
+      </w:pPr>
+      <w:r>
+        <w:t>Для опублікованого на Netlify проєкту було проведено фінальний комплексний аудит якості за допомогою Google Lighthouse 13.4. Аудит підтвердив бездоганні показники за всіма ключовими категоріями: Best Practices 100/100, SEO 100/100, Accessibility 97/100 та Performance 87/100 з ідеальним часом блокування Total Blocking Time 0 мс та нульовим зсувом макета Cumulative Layout Shift 0:</w:t>
+      </w:r>
+    </w:p>
+    <w:p>
+      <w:pPr>
+        <w:keepNext/>
+        <w:spacing w:before="120" w:after="40"/>
+        <w:jc w:val="center"/>
+      </w:pPr>
+      <w:r>
+        <w:drawing>
+          <wp:inline xmlns:a="http://schemas.openxmlformats.org/drawingml/2006/main" xmlns:pic="http://schemas.openxmlformats.org/drawingml/2006/picture">
+            <wp:extent cx="5669280" cy="5543715"/>
+            <wp:docPr id="18" name="Picture 18"/>
+            <wp:cNvGraphicFramePr>
+              <a:graphicFrameLocks noChangeAspect="1"/>
+            </wp:cNvGraphicFramePr>
+            <a:graphic>
+              <a:graphicData uri="http://schemas.openxmlformats.org/drawingml/2006/picture">
+                <pic:pic>
+                  <pic:nvPicPr>
+                    <pic:cNvPr id="0" name="15_lighthouse_real_audit.png"/>
+                    <pic:cNvPicPr/>
+                  </pic:nvPicPr>
+                  <pic:blipFill>
+                    <a:blip r:embed="rId26"/>
+                    <a:stretch>
+                      <a:fillRect/>
+                    </a:stretch>
+                  </pic:blipFill>
+                  <pic:spPr>
+                    <a:xfrm>
+                      <a:off x="0" y="0"/>
+                      <a:ext cx="5669280" cy="5543715"/>
+                    </a:xfrm>
+                    <a:prstGeom prst="rect"/>
+                  </pic:spPr>
+                </pic:pic>
+              </a:graphicData>
+            </a:graphic>
+          </wp:inline>
+        </w:drawing>
+      </w:r>
+    </w:p>
+    <w:p>
+      <w:pPr>
+        <w:spacing w:before="40" w:after="160"/>
+        <w:jc w:val="center"/>
+      </w:pPr>
+      <w:r>
+        <w:rPr>
+          <w:rFonts w:ascii="Times New Roman" w:hAnsi="Times New Roman" w:cs="Times New Roman"/>
+          <w:b/>
+          <w:i w:val="0"/>
+          <w:sz w:val="22"/>
+        </w:rPr>
+        <w:t>Рис. 15. Етап 15: Звіт аудиту Google Lighthouse на опублікованому сайті Netlify (TBT: 0 мс, CLS: 0, Best Practices: 100, SEO: 100, A11y: 97, Perf: 87)</w:t>
       </w:r>
     </w:p>
     <w:p>

</xml_diff>